<commit_message>
Complete regressor pipeline and Stata merge
  Adds download and aggregation scripts for all regressor datasets: TerraClimate
  climate anomalies (PDSI/tmax/ppt with 1981-2010 baseline), CHIRPS precipitation,
  GRIP4 road density, GLOBIO4 MSA biodiversity intactness, and time-varying WDPA
  protected-area panel. Includes fast v2 WDPA panel script using sjoin+clip.

  Adds Stata merge do-file (DoFiles/merge_all_regressors.do) that builds the
  complete analysis panel (BOLD_regressor_panel.dta) from all outcome and regressor
  CSVs. Drops Antarctica and date-line edge cells. Logs to Logs/.

  Updates all documentation: AI_HANDOVER.md, Scripts/README.md, DoFiles/README.md,
  and regressor_dataset_options.md.
</commit_message>
<xml_diff>
--- a/prompts.docx
+++ b/prompts.docx
@@ -2,6 +2,56 @@
 <file path=word/document.xml><?xml version="1.0" encoding="utf-8"?>
 <w:document xmlns:wpc="http://schemas.microsoft.com/office/word/2010/wordprocessingCanvas" xmlns:cx="http://schemas.microsoft.com/office/drawing/2014/chartex" xmlns:cx1="http://schemas.microsoft.com/office/drawing/2015/9/8/chartex" xmlns:cx2="http://schemas.microsoft.com/office/drawing/2015/10/21/chartex" xmlns:cx3="http://schemas.microsoft.com/office/drawing/2016/5/9/chartex" xmlns:cx4="http://schemas.microsoft.com/office/drawing/2016/5/10/chartex" xmlns:cx5="http://schemas.microsoft.com/office/drawing/2016/5/11/chartex" xmlns:cx6="http://schemas.microsoft.com/office/drawing/2016/5/12/chartex" xmlns:cx7="http://schemas.microsoft.com/office/drawing/2016/5/13/chartex" xmlns:cx8="http://schemas.microsoft.com/office/drawing/2016/5/14/chartex" xmlns:mc="http://schemas.openxmlformats.org/markup-compatibility/2006" xmlns:aink="http://schemas.microsoft.com/office/drawing/2016/ink" xmlns:am3d="http://schemas.microsoft.com/office/drawing/2017/model3d" xmlns:o="urn:schemas-microsoft-com:office:office" xmlns:oel="http://schemas.microsoft.com/office/2019/extlst" xmlns:r="http://schemas.openxmlformats.org/officeDocument/2006/relationships" xmlns:m="http://schemas.openxmlformats.org/officeDocument/2006/math" xmlns:v="urn:schemas-microsoft-com:vml" xmlns:wp14="http://schemas.microsoft.com/office/word/2010/wordprocessingDrawing" xmlns:wp="http://schemas.openxmlformats.org/drawingml/2006/wordprocessingDrawing" xmlns:w10="urn:schemas-microsoft-com:office:word" xmlns:w="http://schemas.openxmlformats.org/wordprocessingml/2006/main" xmlns:w14="http://schemas.microsoft.com/office/word/2010/wordml" xmlns:w15="http://schemas.microsoft.com/office/word/2012/wordml" xmlns:w16cex="http://schemas.microsoft.com/office/word/2018/wordml/cex" xmlns:w16cid="http://schemas.microsoft.com/office/word/2016/wordml/cid" xmlns:w16="http://schemas.microsoft.com/office/word/2018/wordml" xmlns:w16du="http://schemas.microsoft.com/office/word/2023/wordml/word16du" xmlns:w16sdtdh="http://schemas.microsoft.com/office/word/2020/wordml/sdtdatahash" xmlns:w16sdtfl="http://schemas.microsoft.com/office/word/2024/wordml/sdtformatlock" xmlns:w16se="http://schemas.microsoft.com/office/word/2015/wordml/symex" xmlns:wpg="http://schemas.microsoft.com/office/word/2010/wordprocessingGroup" xmlns:wpi="http://schemas.microsoft.com/office/word/2010/wordprocessingInk" xmlns:wne="http://schemas.microsoft.com/office/word/2006/wordml" xmlns:wps="http://schemas.microsoft.com/office/word/2010/wordprocessingShape" mc:Ignorable="w14 w15 w16se w16cid w16 w16cex w16sdtdh w16sdtfl w16du wp14">
   <w:body>
+    <w:p>
+      <w:pPr>
+        <w:autoSpaceDE w:val="0"/>
+        <w:autoSpaceDN w:val="0"/>
+        <w:adjustRightInd w:val="0"/>
+        <w:rPr>
+          <w:rFonts w:ascii="AppleSystemUIFont" w:hAnsi="AppleSystemUIFont" w:cs="AppleSystemUIFont"/>
+          <w:sz w:val="26"/>
+          <w:szCs w:val="26"/>
+          <w:lang w:val="es-ES"/>
+        </w:rPr>
+      </w:pPr>
+      <w:proofErr w:type="spellStart"/>
+      <w:r>
+        <w:rPr>
+          <w:rFonts w:ascii="Menlo" w:eastAsiaTheme="minorHAnsi" w:hAnsi="Menlo" w:cs="Menlo"/>
+          <w:color w:val="2EAEBB"/>
+          <w:sz w:val="22"/>
+          <w:szCs w:val="22"/>
+          <w:lang w:val="es-ES" w:eastAsia="en-US"/>
+          <w14:ligatures w14:val="standardContextual"/>
+        </w:rPr>
+        <w:t>codex</w:t>
+      </w:r>
+      <w:proofErr w:type="spellEnd"/>
+      <w:r>
+        <w:rPr>
+          <w:rFonts w:ascii="Menlo" w:eastAsiaTheme="minorHAnsi" w:hAnsi="Menlo" w:cs="Menlo"/>
+          <w:color w:val="2EAEBB"/>
+          <w:sz w:val="22"/>
+          <w:szCs w:val="22"/>
+          <w:lang w:val="es-ES" w:eastAsia="en-US"/>
+          <w14:ligatures w14:val="standardContextual"/>
+        </w:rPr>
+        <w:t xml:space="preserve"> resume 019dd81c-0620-7e82-9a09-8ed4cd10d439</w:t>
+      </w:r>
+    </w:p>
+    <w:p>
+      <w:pPr>
+        <w:autoSpaceDE w:val="0"/>
+        <w:autoSpaceDN w:val="0"/>
+        <w:adjustRightInd w:val="0"/>
+        <w:rPr>
+          <w:rFonts w:ascii="AppleSystemUIFont" w:hAnsi="AppleSystemUIFont" w:cs="AppleSystemUIFont"/>
+          <w:sz w:val="26"/>
+          <w:szCs w:val="26"/>
+          <w:lang w:val="es-ES"/>
+        </w:rPr>
+      </w:pPr>
+    </w:p>
     <w:p>
       <w:pPr>
         <w:autoSpaceDE w:val="0"/>
@@ -3352,6 +3402,7 @@
           <w:szCs w:val="22"/>
           <w:lang w:val="en-GB"/>
         </w:rPr>
+        <w:lastRenderedPageBreak/>
         <w:t xml:space="preserve">  </w:t>
       </w:r>
       <w:r>
@@ -3412,7 +3463,6 @@
           <w:szCs w:val="22"/>
           <w:lang w:val="en-GB"/>
         </w:rPr>
-        <w:lastRenderedPageBreak/>
         <w:t xml:space="preserve">     Use event latitude/longitude and assign to our 100km cells using the same EPSG:6933 grid</w:t>
       </w:r>
     </w:p>
@@ -5335,6 +5385,7 @@
           <w:szCs w:val="22"/>
           <w:lang w:val="en-GB"/>
         </w:rPr>
+        <w:lastRenderedPageBreak/>
         <w:t xml:space="preserve">      - </w:t>
       </w:r>
       <w:proofErr w:type="spellStart"/>
@@ -5385,7 +5436,6 @@
           <w:szCs w:val="22"/>
           <w:lang w:val="en-GB"/>
         </w:rPr>
-        <w:lastRenderedPageBreak/>
         <w:t xml:space="preserve">      - </w:t>
       </w:r>
       <w:r>
@@ -5702,11 +5752,2554 @@
           <w:color w:val="000000" w:themeColor="text1"/>
         </w:rPr>
       </w:pPr>
+      <w:r>
+        <w:rPr>
+          <w:color w:val="000000" w:themeColor="text1"/>
+        </w:rPr>
+        <w:t>Done</w:t>
+      </w:r>
+    </w:p>
+    <w:p>
+      <w:pPr>
+        <w:rPr>
+          <w:color w:val="000000" w:themeColor="text1"/>
+        </w:rPr>
+      </w:pPr>
+    </w:p>
+    <w:p>
+      <w:pPr>
+        <w:rPr>
+          <w:color w:val="000000" w:themeColor="text1"/>
+        </w:rPr>
+      </w:pPr>
+      <w:r>
+        <w:rPr>
+          <w:color w:val="000000" w:themeColor="text1"/>
+          <w:highlight w:val="yellow"/>
+        </w:rPr>
+        <w:t>Codex</w:t>
+      </w:r>
     </w:p>
     <w:p>
       <w:pPr>
         <w:rPr>
           <w:lang w:val="en-US"/>
+        </w:rPr>
+      </w:pPr>
+    </w:p>
+    <w:p>
+      <w:pPr>
+        <w:tabs>
+          <w:tab w:val="left" w:pos="560"/>
+          <w:tab w:val="left" w:pos="1120"/>
+          <w:tab w:val="left" w:pos="1680"/>
+          <w:tab w:val="left" w:pos="2240"/>
+          <w:tab w:val="left" w:pos="2800"/>
+          <w:tab w:val="left" w:pos="3360"/>
+          <w:tab w:val="left" w:pos="3920"/>
+          <w:tab w:val="left" w:pos="4480"/>
+          <w:tab w:val="left" w:pos="5040"/>
+          <w:tab w:val="left" w:pos="5600"/>
+          <w:tab w:val="left" w:pos="6160"/>
+          <w:tab w:val="left" w:pos="6720"/>
+        </w:tabs>
+        <w:autoSpaceDE w:val="0"/>
+        <w:autoSpaceDN w:val="0"/>
+        <w:adjustRightInd w:val="0"/>
+        <w:rPr>
+          <w:rFonts w:ascii="Menlo" w:eastAsiaTheme="minorHAnsi" w:hAnsi="Menlo" w:cs="Menlo"/>
+          <w:color w:val="000000"/>
+          <w:sz w:val="22"/>
+          <w:szCs w:val="22"/>
+          <w:lang w:val="en-GB" w:eastAsia="en-US"/>
+          <w14:ligatures w14:val="standardContextual"/>
+        </w:rPr>
+      </w:pPr>
+      <w:r>
+        <w:rPr>
+          <w:rFonts w:ascii="Menlo" w:eastAsiaTheme="minorHAnsi" w:hAnsi="Menlo" w:cs="Menlo"/>
+          <w:b/>
+          <w:bCs/>
+          <w:color w:val="000000"/>
+          <w:sz w:val="22"/>
+          <w:szCs w:val="22"/>
+          <w:lang w:val="en-GB" w:eastAsia="en-US"/>
+          <w14:ligatures w14:val="standardContextual"/>
+        </w:rPr>
+        <w:t>#1 RESOLVE ecoregions / biome / realm</w:t>
+      </w:r>
+    </w:p>
+    <w:p>
+      <w:pPr>
+        <w:tabs>
+          <w:tab w:val="left" w:pos="560"/>
+          <w:tab w:val="left" w:pos="1120"/>
+          <w:tab w:val="left" w:pos="1680"/>
+          <w:tab w:val="left" w:pos="2240"/>
+          <w:tab w:val="left" w:pos="2800"/>
+          <w:tab w:val="left" w:pos="3360"/>
+          <w:tab w:val="left" w:pos="3920"/>
+          <w:tab w:val="left" w:pos="4480"/>
+          <w:tab w:val="left" w:pos="5040"/>
+          <w:tab w:val="left" w:pos="5600"/>
+          <w:tab w:val="left" w:pos="6160"/>
+          <w:tab w:val="left" w:pos="6720"/>
+        </w:tabs>
+        <w:autoSpaceDE w:val="0"/>
+        <w:autoSpaceDN w:val="0"/>
+        <w:adjustRightInd w:val="0"/>
+        <w:rPr>
+          <w:rFonts w:ascii="Menlo" w:eastAsiaTheme="minorHAnsi" w:hAnsi="Menlo" w:cs="Menlo"/>
+          <w:color w:val="000000"/>
+          <w:sz w:val="22"/>
+          <w:szCs w:val="22"/>
+          <w:lang w:val="en-GB" w:eastAsia="en-US"/>
+          <w14:ligatures w14:val="standardContextual"/>
+        </w:rPr>
+      </w:pPr>
+    </w:p>
+    <w:p>
+      <w:pPr>
+        <w:tabs>
+          <w:tab w:val="left" w:pos="560"/>
+          <w:tab w:val="left" w:pos="1120"/>
+          <w:tab w:val="left" w:pos="1680"/>
+          <w:tab w:val="left" w:pos="2240"/>
+          <w:tab w:val="left" w:pos="2800"/>
+          <w:tab w:val="left" w:pos="3360"/>
+          <w:tab w:val="left" w:pos="3920"/>
+          <w:tab w:val="left" w:pos="4480"/>
+          <w:tab w:val="left" w:pos="5040"/>
+          <w:tab w:val="left" w:pos="5600"/>
+          <w:tab w:val="left" w:pos="6160"/>
+          <w:tab w:val="left" w:pos="6720"/>
+        </w:tabs>
+        <w:autoSpaceDE w:val="0"/>
+        <w:autoSpaceDN w:val="0"/>
+        <w:adjustRightInd w:val="0"/>
+        <w:rPr>
+          <w:rFonts w:ascii="Menlo" w:eastAsiaTheme="minorHAnsi" w:hAnsi="Menlo" w:cs="Menlo"/>
+          <w:color w:val="000000"/>
+          <w:sz w:val="22"/>
+          <w:szCs w:val="22"/>
+          <w:lang w:val="en-GB" w:eastAsia="en-US"/>
+          <w14:ligatures w14:val="standardContextual"/>
+        </w:rPr>
+      </w:pPr>
+      <w:r>
+        <w:rPr>
+          <w:rFonts w:ascii="Menlo" w:eastAsiaTheme="minorHAnsi" w:hAnsi="Menlo" w:cs="Menlo"/>
+          <w:color w:val="000000"/>
+          <w:sz w:val="22"/>
+          <w:szCs w:val="22"/>
+          <w:lang w:val="en-GB" w:eastAsia="en-US"/>
+          <w14:ligatures w14:val="standardContextual"/>
+        </w:rPr>
+        <w:t xml:space="preserve">  Input files:</w:t>
+      </w:r>
+    </w:p>
+    <w:p>
+      <w:pPr>
+        <w:tabs>
+          <w:tab w:val="left" w:pos="560"/>
+          <w:tab w:val="left" w:pos="1120"/>
+          <w:tab w:val="left" w:pos="1680"/>
+          <w:tab w:val="left" w:pos="2240"/>
+          <w:tab w:val="left" w:pos="2800"/>
+          <w:tab w:val="left" w:pos="3360"/>
+          <w:tab w:val="left" w:pos="3920"/>
+          <w:tab w:val="left" w:pos="4480"/>
+          <w:tab w:val="left" w:pos="5040"/>
+          <w:tab w:val="left" w:pos="5600"/>
+          <w:tab w:val="left" w:pos="6160"/>
+          <w:tab w:val="left" w:pos="6720"/>
+        </w:tabs>
+        <w:autoSpaceDE w:val="0"/>
+        <w:autoSpaceDN w:val="0"/>
+        <w:adjustRightInd w:val="0"/>
+        <w:rPr>
+          <w:rFonts w:ascii="Menlo" w:eastAsiaTheme="minorHAnsi" w:hAnsi="Menlo" w:cs="Menlo"/>
+          <w:color w:val="000000"/>
+          <w:sz w:val="22"/>
+          <w:szCs w:val="22"/>
+          <w:lang w:val="en-GB" w:eastAsia="en-US"/>
+          <w14:ligatures w14:val="standardContextual"/>
+        </w:rPr>
+      </w:pPr>
+    </w:p>
+    <w:p>
+      <w:pPr>
+        <w:tabs>
+          <w:tab w:val="left" w:pos="560"/>
+          <w:tab w:val="left" w:pos="1120"/>
+          <w:tab w:val="left" w:pos="1680"/>
+          <w:tab w:val="left" w:pos="2240"/>
+          <w:tab w:val="left" w:pos="2800"/>
+          <w:tab w:val="left" w:pos="3360"/>
+          <w:tab w:val="left" w:pos="3920"/>
+          <w:tab w:val="left" w:pos="4480"/>
+          <w:tab w:val="left" w:pos="5040"/>
+          <w:tab w:val="left" w:pos="5600"/>
+          <w:tab w:val="left" w:pos="6160"/>
+          <w:tab w:val="left" w:pos="6720"/>
+        </w:tabs>
+        <w:autoSpaceDE w:val="0"/>
+        <w:autoSpaceDN w:val="0"/>
+        <w:adjustRightInd w:val="0"/>
+        <w:rPr>
+          <w:rFonts w:ascii="Menlo" w:eastAsiaTheme="minorHAnsi" w:hAnsi="Menlo" w:cs="Menlo"/>
+          <w:color w:val="000000"/>
+          <w:sz w:val="22"/>
+          <w:szCs w:val="22"/>
+          <w:lang w:val="en-GB" w:eastAsia="en-US"/>
+          <w14:ligatures w14:val="standardContextual"/>
+        </w:rPr>
+      </w:pPr>
+      <w:r>
+        <w:rPr>
+          <w:rFonts w:ascii="Menlo" w:eastAsiaTheme="minorHAnsi" w:hAnsi="Menlo" w:cs="Menlo"/>
+          <w:color w:val="000000"/>
+          <w:sz w:val="22"/>
+          <w:szCs w:val="22"/>
+          <w:lang w:val="en-GB" w:eastAsia="en-US"/>
+          <w14:ligatures w14:val="standardContextual"/>
+        </w:rPr>
+        <w:t xml:space="preserve">  Data/raw/baseline_geography/resolve_ecoregions/Ecoregions2017.shp</w:t>
+      </w:r>
+    </w:p>
+    <w:p>
+      <w:pPr>
+        <w:tabs>
+          <w:tab w:val="left" w:pos="560"/>
+          <w:tab w:val="left" w:pos="1120"/>
+          <w:tab w:val="left" w:pos="1680"/>
+          <w:tab w:val="left" w:pos="2240"/>
+          <w:tab w:val="left" w:pos="2800"/>
+          <w:tab w:val="left" w:pos="3360"/>
+          <w:tab w:val="left" w:pos="3920"/>
+          <w:tab w:val="left" w:pos="4480"/>
+          <w:tab w:val="left" w:pos="5040"/>
+          <w:tab w:val="left" w:pos="5600"/>
+          <w:tab w:val="left" w:pos="6160"/>
+          <w:tab w:val="left" w:pos="6720"/>
+        </w:tabs>
+        <w:autoSpaceDE w:val="0"/>
+        <w:autoSpaceDN w:val="0"/>
+        <w:adjustRightInd w:val="0"/>
+        <w:rPr>
+          <w:rFonts w:ascii="Menlo" w:eastAsiaTheme="minorHAnsi" w:hAnsi="Menlo" w:cs="Menlo"/>
+          <w:color w:val="000000"/>
+          <w:sz w:val="22"/>
+          <w:szCs w:val="22"/>
+          <w:lang w:val="en-GB" w:eastAsia="en-US"/>
+          <w14:ligatures w14:val="standardContextual"/>
+        </w:rPr>
+      </w:pPr>
+      <w:r>
+        <w:rPr>
+          <w:rFonts w:ascii="Menlo" w:eastAsiaTheme="minorHAnsi" w:hAnsi="Menlo" w:cs="Menlo"/>
+          <w:color w:val="000000"/>
+          <w:sz w:val="22"/>
+          <w:szCs w:val="22"/>
+          <w:lang w:val="en-GB" w:eastAsia="en-US"/>
+          <w14:ligatures w14:val="standardContextual"/>
+        </w:rPr>
+        <w:t xml:space="preserve">  Data/raw/baseline_geography/resolve_ecoregions/Ecoregions2017.dbf</w:t>
+      </w:r>
+    </w:p>
+    <w:p>
+      <w:pPr>
+        <w:tabs>
+          <w:tab w:val="left" w:pos="560"/>
+          <w:tab w:val="left" w:pos="1120"/>
+          <w:tab w:val="left" w:pos="1680"/>
+          <w:tab w:val="left" w:pos="2240"/>
+          <w:tab w:val="left" w:pos="2800"/>
+          <w:tab w:val="left" w:pos="3360"/>
+          <w:tab w:val="left" w:pos="3920"/>
+          <w:tab w:val="left" w:pos="4480"/>
+          <w:tab w:val="left" w:pos="5040"/>
+          <w:tab w:val="left" w:pos="5600"/>
+          <w:tab w:val="left" w:pos="6160"/>
+          <w:tab w:val="left" w:pos="6720"/>
+        </w:tabs>
+        <w:autoSpaceDE w:val="0"/>
+        <w:autoSpaceDN w:val="0"/>
+        <w:adjustRightInd w:val="0"/>
+        <w:rPr>
+          <w:rFonts w:ascii="Menlo" w:eastAsiaTheme="minorHAnsi" w:hAnsi="Menlo" w:cs="Menlo"/>
+          <w:color w:val="000000"/>
+          <w:sz w:val="22"/>
+          <w:szCs w:val="22"/>
+          <w:lang w:val="en-GB" w:eastAsia="en-US"/>
+          <w14:ligatures w14:val="standardContextual"/>
+        </w:rPr>
+      </w:pPr>
+      <w:r>
+        <w:rPr>
+          <w:rFonts w:ascii="Menlo" w:eastAsiaTheme="minorHAnsi" w:hAnsi="Menlo" w:cs="Menlo"/>
+          <w:color w:val="000000"/>
+          <w:sz w:val="22"/>
+          <w:szCs w:val="22"/>
+          <w:lang w:val="en-GB" w:eastAsia="en-US"/>
+          <w14:ligatures w14:val="standardContextual"/>
+        </w:rPr>
+        <w:t xml:space="preserve">  Data/raw/baseline_geography/resolve_ecoregions/Ecoregions2017.shx</w:t>
+      </w:r>
+    </w:p>
+    <w:p>
+      <w:pPr>
+        <w:tabs>
+          <w:tab w:val="left" w:pos="560"/>
+          <w:tab w:val="left" w:pos="1120"/>
+          <w:tab w:val="left" w:pos="1680"/>
+          <w:tab w:val="left" w:pos="2240"/>
+          <w:tab w:val="left" w:pos="2800"/>
+          <w:tab w:val="left" w:pos="3360"/>
+          <w:tab w:val="left" w:pos="3920"/>
+          <w:tab w:val="left" w:pos="4480"/>
+          <w:tab w:val="left" w:pos="5040"/>
+          <w:tab w:val="left" w:pos="5600"/>
+          <w:tab w:val="left" w:pos="6160"/>
+          <w:tab w:val="left" w:pos="6720"/>
+        </w:tabs>
+        <w:autoSpaceDE w:val="0"/>
+        <w:autoSpaceDN w:val="0"/>
+        <w:adjustRightInd w:val="0"/>
+        <w:rPr>
+          <w:rFonts w:ascii="Menlo" w:eastAsiaTheme="minorHAnsi" w:hAnsi="Menlo" w:cs="Menlo"/>
+          <w:color w:val="000000"/>
+          <w:sz w:val="22"/>
+          <w:szCs w:val="22"/>
+          <w:lang w:val="en-GB" w:eastAsia="en-US"/>
+          <w14:ligatures w14:val="standardContextual"/>
+        </w:rPr>
+      </w:pPr>
+      <w:r>
+        <w:rPr>
+          <w:rFonts w:ascii="Menlo" w:eastAsiaTheme="minorHAnsi" w:hAnsi="Menlo" w:cs="Menlo"/>
+          <w:color w:val="000000"/>
+          <w:sz w:val="22"/>
+          <w:szCs w:val="22"/>
+          <w:lang w:val="en-GB" w:eastAsia="en-US"/>
+          <w14:ligatures w14:val="standardContextual"/>
+        </w:rPr>
+        <w:t xml:space="preserve">  Data/raw/baseline_geography/resolve_ecoregions/Ecoregions2017.prj</w:t>
+      </w:r>
+    </w:p>
+    <w:p>
+      <w:pPr>
+        <w:tabs>
+          <w:tab w:val="left" w:pos="560"/>
+          <w:tab w:val="left" w:pos="1120"/>
+          <w:tab w:val="left" w:pos="1680"/>
+          <w:tab w:val="left" w:pos="2240"/>
+          <w:tab w:val="left" w:pos="2800"/>
+          <w:tab w:val="left" w:pos="3360"/>
+          <w:tab w:val="left" w:pos="3920"/>
+          <w:tab w:val="left" w:pos="4480"/>
+          <w:tab w:val="left" w:pos="5040"/>
+          <w:tab w:val="left" w:pos="5600"/>
+          <w:tab w:val="left" w:pos="6160"/>
+          <w:tab w:val="left" w:pos="6720"/>
+        </w:tabs>
+        <w:autoSpaceDE w:val="0"/>
+        <w:autoSpaceDN w:val="0"/>
+        <w:adjustRightInd w:val="0"/>
+        <w:rPr>
+          <w:rFonts w:ascii="Menlo" w:eastAsiaTheme="minorHAnsi" w:hAnsi="Menlo" w:cs="Menlo"/>
+          <w:color w:val="000000"/>
+          <w:sz w:val="22"/>
+          <w:szCs w:val="22"/>
+          <w:lang w:val="en-GB" w:eastAsia="en-US"/>
+          <w14:ligatures w14:val="standardContextual"/>
+        </w:rPr>
+      </w:pPr>
+    </w:p>
+    <w:p>
+      <w:pPr>
+        <w:tabs>
+          <w:tab w:val="left" w:pos="560"/>
+          <w:tab w:val="left" w:pos="1120"/>
+          <w:tab w:val="left" w:pos="1680"/>
+          <w:tab w:val="left" w:pos="2240"/>
+          <w:tab w:val="left" w:pos="2800"/>
+          <w:tab w:val="left" w:pos="3360"/>
+          <w:tab w:val="left" w:pos="3920"/>
+          <w:tab w:val="left" w:pos="4480"/>
+          <w:tab w:val="left" w:pos="5040"/>
+          <w:tab w:val="left" w:pos="5600"/>
+          <w:tab w:val="left" w:pos="6160"/>
+          <w:tab w:val="left" w:pos="6720"/>
+        </w:tabs>
+        <w:autoSpaceDE w:val="0"/>
+        <w:autoSpaceDN w:val="0"/>
+        <w:adjustRightInd w:val="0"/>
+        <w:rPr>
+          <w:rFonts w:ascii="Menlo" w:eastAsiaTheme="minorHAnsi" w:hAnsi="Menlo" w:cs="Menlo"/>
+          <w:color w:val="000000"/>
+          <w:sz w:val="22"/>
+          <w:szCs w:val="22"/>
+          <w:lang w:val="en-GB" w:eastAsia="en-US"/>
+          <w14:ligatures w14:val="standardContextual"/>
+        </w:rPr>
+      </w:pPr>
+      <w:r>
+        <w:rPr>
+          <w:rFonts w:ascii="Menlo" w:eastAsiaTheme="minorHAnsi" w:hAnsi="Menlo" w:cs="Menlo"/>
+          <w:color w:val="000000"/>
+          <w:sz w:val="22"/>
+          <w:szCs w:val="22"/>
+          <w:lang w:val="en-GB" w:eastAsia="en-US"/>
+          <w14:ligatures w14:val="standardContextual"/>
+        </w:rPr>
+        <w:t xml:space="preserve">  Downloaded zip:</w:t>
+      </w:r>
+    </w:p>
+    <w:p>
+      <w:pPr>
+        <w:tabs>
+          <w:tab w:val="left" w:pos="560"/>
+          <w:tab w:val="left" w:pos="1120"/>
+          <w:tab w:val="left" w:pos="1680"/>
+          <w:tab w:val="left" w:pos="2240"/>
+          <w:tab w:val="left" w:pos="2800"/>
+          <w:tab w:val="left" w:pos="3360"/>
+          <w:tab w:val="left" w:pos="3920"/>
+          <w:tab w:val="left" w:pos="4480"/>
+          <w:tab w:val="left" w:pos="5040"/>
+          <w:tab w:val="left" w:pos="5600"/>
+          <w:tab w:val="left" w:pos="6160"/>
+          <w:tab w:val="left" w:pos="6720"/>
+        </w:tabs>
+        <w:autoSpaceDE w:val="0"/>
+        <w:autoSpaceDN w:val="0"/>
+        <w:adjustRightInd w:val="0"/>
+        <w:rPr>
+          <w:rFonts w:ascii="Menlo" w:eastAsiaTheme="minorHAnsi" w:hAnsi="Menlo" w:cs="Menlo"/>
+          <w:color w:val="000000"/>
+          <w:sz w:val="22"/>
+          <w:szCs w:val="22"/>
+          <w:lang w:val="en-GB" w:eastAsia="en-US"/>
+          <w14:ligatures w14:val="standardContextual"/>
+        </w:rPr>
+      </w:pPr>
+    </w:p>
+    <w:p>
+      <w:pPr>
+        <w:tabs>
+          <w:tab w:val="left" w:pos="560"/>
+          <w:tab w:val="left" w:pos="1120"/>
+          <w:tab w:val="left" w:pos="1680"/>
+          <w:tab w:val="left" w:pos="2240"/>
+          <w:tab w:val="left" w:pos="2800"/>
+          <w:tab w:val="left" w:pos="3360"/>
+          <w:tab w:val="left" w:pos="3920"/>
+          <w:tab w:val="left" w:pos="4480"/>
+          <w:tab w:val="left" w:pos="5040"/>
+          <w:tab w:val="left" w:pos="5600"/>
+          <w:tab w:val="left" w:pos="6160"/>
+          <w:tab w:val="left" w:pos="6720"/>
+        </w:tabs>
+        <w:autoSpaceDE w:val="0"/>
+        <w:autoSpaceDN w:val="0"/>
+        <w:adjustRightInd w:val="0"/>
+        <w:rPr>
+          <w:rFonts w:ascii="Menlo" w:eastAsiaTheme="minorHAnsi" w:hAnsi="Menlo" w:cs="Menlo"/>
+          <w:color w:val="000000"/>
+          <w:sz w:val="22"/>
+          <w:szCs w:val="22"/>
+          <w:lang w:val="en-GB" w:eastAsia="en-US"/>
+          <w14:ligatures w14:val="standardContextual"/>
+        </w:rPr>
+      </w:pPr>
+      <w:r>
+        <w:rPr>
+          <w:rFonts w:ascii="Menlo" w:eastAsiaTheme="minorHAnsi" w:hAnsi="Menlo" w:cs="Menlo"/>
+          <w:color w:val="000000"/>
+          <w:sz w:val="22"/>
+          <w:szCs w:val="22"/>
+          <w:lang w:val="en-GB" w:eastAsia="en-US"/>
+          <w14:ligatures w14:val="standardContextual"/>
+        </w:rPr>
+        <w:t xml:space="preserve">  Data/raw/baseline_geography/resolve_ecoregions/Ecoregions2017.zip</w:t>
+      </w:r>
+    </w:p>
+    <w:p>
+      <w:pPr>
+        <w:tabs>
+          <w:tab w:val="left" w:pos="560"/>
+          <w:tab w:val="left" w:pos="1120"/>
+          <w:tab w:val="left" w:pos="1680"/>
+          <w:tab w:val="left" w:pos="2240"/>
+          <w:tab w:val="left" w:pos="2800"/>
+          <w:tab w:val="left" w:pos="3360"/>
+          <w:tab w:val="left" w:pos="3920"/>
+          <w:tab w:val="left" w:pos="4480"/>
+          <w:tab w:val="left" w:pos="5040"/>
+          <w:tab w:val="left" w:pos="5600"/>
+          <w:tab w:val="left" w:pos="6160"/>
+          <w:tab w:val="left" w:pos="6720"/>
+        </w:tabs>
+        <w:autoSpaceDE w:val="0"/>
+        <w:autoSpaceDN w:val="0"/>
+        <w:adjustRightInd w:val="0"/>
+        <w:rPr>
+          <w:rFonts w:ascii="Menlo" w:eastAsiaTheme="minorHAnsi" w:hAnsi="Menlo" w:cs="Menlo"/>
+          <w:color w:val="000000"/>
+          <w:sz w:val="22"/>
+          <w:szCs w:val="22"/>
+          <w:lang w:val="en-GB" w:eastAsia="en-US"/>
+          <w14:ligatures w14:val="standardContextual"/>
+        </w:rPr>
+      </w:pPr>
+    </w:p>
+    <w:p>
+      <w:pPr>
+        <w:tabs>
+          <w:tab w:val="left" w:pos="560"/>
+          <w:tab w:val="left" w:pos="1120"/>
+          <w:tab w:val="left" w:pos="1680"/>
+          <w:tab w:val="left" w:pos="2240"/>
+          <w:tab w:val="left" w:pos="2800"/>
+          <w:tab w:val="left" w:pos="3360"/>
+          <w:tab w:val="left" w:pos="3920"/>
+          <w:tab w:val="left" w:pos="4480"/>
+          <w:tab w:val="left" w:pos="5040"/>
+          <w:tab w:val="left" w:pos="5600"/>
+          <w:tab w:val="left" w:pos="6160"/>
+          <w:tab w:val="left" w:pos="6720"/>
+        </w:tabs>
+        <w:autoSpaceDE w:val="0"/>
+        <w:autoSpaceDN w:val="0"/>
+        <w:adjustRightInd w:val="0"/>
+        <w:rPr>
+          <w:rFonts w:ascii="Menlo" w:eastAsiaTheme="minorHAnsi" w:hAnsi="Menlo" w:cs="Menlo"/>
+          <w:color w:val="000000"/>
+          <w:sz w:val="22"/>
+          <w:szCs w:val="22"/>
+          <w:lang w:val="en-GB" w:eastAsia="en-US"/>
+          <w14:ligatures w14:val="standardContextual"/>
+        </w:rPr>
+      </w:pPr>
+      <w:r>
+        <w:rPr>
+          <w:rFonts w:ascii="Menlo" w:eastAsiaTheme="minorHAnsi" w:hAnsi="Menlo" w:cs="Menlo"/>
+          <w:color w:val="000000"/>
+          <w:sz w:val="22"/>
+          <w:szCs w:val="22"/>
+          <w:lang w:val="en-GB" w:eastAsia="en-US"/>
+          <w14:ligatures w14:val="standardContextual"/>
+        </w:rPr>
+        <w:t xml:space="preserve">  It is the RESOLVE 2017 terrestrial ecoregions shapefile. I used it to assign each BOLD 100km land-cell</w:t>
+      </w:r>
+    </w:p>
+    <w:p>
+      <w:pPr>
+        <w:tabs>
+          <w:tab w:val="left" w:pos="560"/>
+          <w:tab w:val="left" w:pos="1120"/>
+          <w:tab w:val="left" w:pos="1680"/>
+          <w:tab w:val="left" w:pos="2240"/>
+          <w:tab w:val="left" w:pos="2800"/>
+          <w:tab w:val="left" w:pos="3360"/>
+          <w:tab w:val="left" w:pos="3920"/>
+          <w:tab w:val="left" w:pos="4480"/>
+          <w:tab w:val="left" w:pos="5040"/>
+          <w:tab w:val="left" w:pos="5600"/>
+          <w:tab w:val="left" w:pos="6160"/>
+          <w:tab w:val="left" w:pos="6720"/>
+        </w:tabs>
+        <w:autoSpaceDE w:val="0"/>
+        <w:autoSpaceDN w:val="0"/>
+        <w:adjustRightInd w:val="0"/>
+        <w:rPr>
+          <w:rFonts w:ascii="Menlo" w:eastAsiaTheme="minorHAnsi" w:hAnsi="Menlo" w:cs="Menlo"/>
+          <w:color w:val="000000"/>
+          <w:sz w:val="22"/>
+          <w:szCs w:val="22"/>
+          <w:lang w:val="en-GB" w:eastAsia="en-US"/>
+          <w14:ligatures w14:val="standardContextual"/>
+        </w:rPr>
+      </w:pPr>
+      <w:r>
+        <w:rPr>
+          <w:rFonts w:ascii="Menlo" w:eastAsiaTheme="minorHAnsi" w:hAnsi="Menlo" w:cs="Menlo"/>
+          <w:color w:val="000000"/>
+          <w:sz w:val="22"/>
+          <w:szCs w:val="22"/>
+          <w:lang w:val="en-GB" w:eastAsia="en-US"/>
+          <w14:ligatures w14:val="standardContextual"/>
+        </w:rPr>
+        <w:t xml:space="preserve">  centroid to ecoregion / biome / realm.</w:t>
+      </w:r>
+    </w:p>
+    <w:p>
+      <w:pPr>
+        <w:tabs>
+          <w:tab w:val="left" w:pos="560"/>
+          <w:tab w:val="left" w:pos="1120"/>
+          <w:tab w:val="left" w:pos="1680"/>
+          <w:tab w:val="left" w:pos="2240"/>
+          <w:tab w:val="left" w:pos="2800"/>
+          <w:tab w:val="left" w:pos="3360"/>
+          <w:tab w:val="left" w:pos="3920"/>
+          <w:tab w:val="left" w:pos="4480"/>
+          <w:tab w:val="left" w:pos="5040"/>
+          <w:tab w:val="left" w:pos="5600"/>
+          <w:tab w:val="left" w:pos="6160"/>
+          <w:tab w:val="left" w:pos="6720"/>
+        </w:tabs>
+        <w:autoSpaceDE w:val="0"/>
+        <w:autoSpaceDN w:val="0"/>
+        <w:adjustRightInd w:val="0"/>
+        <w:rPr>
+          <w:rFonts w:ascii="Menlo" w:eastAsiaTheme="minorHAnsi" w:hAnsi="Menlo" w:cs="Menlo"/>
+          <w:color w:val="000000"/>
+          <w:sz w:val="22"/>
+          <w:szCs w:val="22"/>
+          <w:lang w:val="en-GB" w:eastAsia="en-US"/>
+          <w14:ligatures w14:val="standardContextual"/>
+        </w:rPr>
+      </w:pPr>
+    </w:p>
+    <w:p>
+      <w:pPr>
+        <w:tabs>
+          <w:tab w:val="left" w:pos="560"/>
+          <w:tab w:val="left" w:pos="1120"/>
+          <w:tab w:val="left" w:pos="1680"/>
+          <w:tab w:val="left" w:pos="2240"/>
+          <w:tab w:val="left" w:pos="2800"/>
+          <w:tab w:val="left" w:pos="3360"/>
+          <w:tab w:val="left" w:pos="3920"/>
+          <w:tab w:val="left" w:pos="4480"/>
+          <w:tab w:val="left" w:pos="5040"/>
+          <w:tab w:val="left" w:pos="5600"/>
+          <w:tab w:val="left" w:pos="6160"/>
+          <w:tab w:val="left" w:pos="6720"/>
+        </w:tabs>
+        <w:autoSpaceDE w:val="0"/>
+        <w:autoSpaceDN w:val="0"/>
+        <w:adjustRightInd w:val="0"/>
+        <w:rPr>
+          <w:rFonts w:ascii="Menlo" w:eastAsiaTheme="minorHAnsi" w:hAnsi="Menlo" w:cs="Menlo"/>
+          <w:color w:val="000000"/>
+          <w:sz w:val="22"/>
+          <w:szCs w:val="22"/>
+          <w:lang w:val="en-GB" w:eastAsia="en-US"/>
+          <w14:ligatures w14:val="standardContextual"/>
+        </w:rPr>
+      </w:pPr>
+      <w:r>
+        <w:rPr>
+          <w:rFonts w:ascii="Menlo" w:eastAsiaTheme="minorHAnsi" w:hAnsi="Menlo" w:cs="Menlo"/>
+          <w:color w:val="000000"/>
+          <w:sz w:val="22"/>
+          <w:szCs w:val="22"/>
+          <w:lang w:val="en-GB" w:eastAsia="en-US"/>
+          <w14:ligatures w14:val="standardContextual"/>
+        </w:rPr>
+        <w:t xml:space="preserve">  </w:t>
+      </w:r>
+      <w:r>
+        <w:rPr>
+          <w:rFonts w:ascii="Menlo" w:eastAsiaTheme="minorHAnsi" w:hAnsi="Menlo" w:cs="Menlo"/>
+          <w:b/>
+          <w:bCs/>
+          <w:color w:val="000000"/>
+          <w:sz w:val="22"/>
+          <w:szCs w:val="22"/>
+          <w:lang w:val="en-GB" w:eastAsia="en-US"/>
+          <w14:ligatures w14:val="standardContextual"/>
+        </w:rPr>
+        <w:t>#2 CEPF biodiversity hotspots</w:t>
+      </w:r>
+    </w:p>
+    <w:p>
+      <w:pPr>
+        <w:tabs>
+          <w:tab w:val="left" w:pos="560"/>
+          <w:tab w:val="left" w:pos="1120"/>
+          <w:tab w:val="left" w:pos="1680"/>
+          <w:tab w:val="left" w:pos="2240"/>
+          <w:tab w:val="left" w:pos="2800"/>
+          <w:tab w:val="left" w:pos="3360"/>
+          <w:tab w:val="left" w:pos="3920"/>
+          <w:tab w:val="left" w:pos="4480"/>
+          <w:tab w:val="left" w:pos="5040"/>
+          <w:tab w:val="left" w:pos="5600"/>
+          <w:tab w:val="left" w:pos="6160"/>
+          <w:tab w:val="left" w:pos="6720"/>
+        </w:tabs>
+        <w:autoSpaceDE w:val="0"/>
+        <w:autoSpaceDN w:val="0"/>
+        <w:adjustRightInd w:val="0"/>
+        <w:rPr>
+          <w:rFonts w:ascii="Menlo" w:eastAsiaTheme="minorHAnsi" w:hAnsi="Menlo" w:cs="Menlo"/>
+          <w:color w:val="000000"/>
+          <w:sz w:val="22"/>
+          <w:szCs w:val="22"/>
+          <w:lang w:val="en-GB" w:eastAsia="en-US"/>
+          <w14:ligatures w14:val="standardContextual"/>
+        </w:rPr>
+      </w:pPr>
+    </w:p>
+    <w:p>
+      <w:pPr>
+        <w:tabs>
+          <w:tab w:val="left" w:pos="560"/>
+          <w:tab w:val="left" w:pos="1120"/>
+          <w:tab w:val="left" w:pos="1680"/>
+          <w:tab w:val="left" w:pos="2240"/>
+          <w:tab w:val="left" w:pos="2800"/>
+          <w:tab w:val="left" w:pos="3360"/>
+          <w:tab w:val="left" w:pos="3920"/>
+          <w:tab w:val="left" w:pos="4480"/>
+          <w:tab w:val="left" w:pos="5040"/>
+          <w:tab w:val="left" w:pos="5600"/>
+          <w:tab w:val="left" w:pos="6160"/>
+          <w:tab w:val="left" w:pos="6720"/>
+        </w:tabs>
+        <w:autoSpaceDE w:val="0"/>
+        <w:autoSpaceDN w:val="0"/>
+        <w:adjustRightInd w:val="0"/>
+        <w:rPr>
+          <w:rFonts w:ascii="Menlo" w:eastAsiaTheme="minorHAnsi" w:hAnsi="Menlo" w:cs="Menlo"/>
+          <w:color w:val="000000"/>
+          <w:sz w:val="22"/>
+          <w:szCs w:val="22"/>
+          <w:lang w:val="en-GB" w:eastAsia="en-US"/>
+          <w14:ligatures w14:val="standardContextual"/>
+        </w:rPr>
+      </w:pPr>
+      <w:r>
+        <w:rPr>
+          <w:rFonts w:ascii="Menlo" w:eastAsiaTheme="minorHAnsi" w:hAnsi="Menlo" w:cs="Menlo"/>
+          <w:color w:val="000000"/>
+          <w:sz w:val="22"/>
+          <w:szCs w:val="22"/>
+          <w:lang w:val="en-GB" w:eastAsia="en-US"/>
+          <w14:ligatures w14:val="standardContextual"/>
+        </w:rPr>
+        <w:t xml:space="preserve">  Input file:</w:t>
+      </w:r>
+    </w:p>
+    <w:p>
+      <w:pPr>
+        <w:tabs>
+          <w:tab w:val="left" w:pos="560"/>
+          <w:tab w:val="left" w:pos="1120"/>
+          <w:tab w:val="left" w:pos="1680"/>
+          <w:tab w:val="left" w:pos="2240"/>
+          <w:tab w:val="left" w:pos="2800"/>
+          <w:tab w:val="left" w:pos="3360"/>
+          <w:tab w:val="left" w:pos="3920"/>
+          <w:tab w:val="left" w:pos="4480"/>
+          <w:tab w:val="left" w:pos="5040"/>
+          <w:tab w:val="left" w:pos="5600"/>
+          <w:tab w:val="left" w:pos="6160"/>
+          <w:tab w:val="left" w:pos="6720"/>
+        </w:tabs>
+        <w:autoSpaceDE w:val="0"/>
+        <w:autoSpaceDN w:val="0"/>
+        <w:adjustRightInd w:val="0"/>
+        <w:rPr>
+          <w:rFonts w:ascii="Menlo" w:eastAsiaTheme="minorHAnsi" w:hAnsi="Menlo" w:cs="Menlo"/>
+          <w:color w:val="000000"/>
+          <w:sz w:val="22"/>
+          <w:szCs w:val="22"/>
+          <w:lang w:val="en-GB" w:eastAsia="en-US"/>
+          <w14:ligatures w14:val="standardContextual"/>
+        </w:rPr>
+      </w:pPr>
+    </w:p>
+    <w:p>
+      <w:pPr>
+        <w:tabs>
+          <w:tab w:val="left" w:pos="560"/>
+          <w:tab w:val="left" w:pos="1120"/>
+          <w:tab w:val="left" w:pos="1680"/>
+          <w:tab w:val="left" w:pos="2240"/>
+          <w:tab w:val="left" w:pos="2800"/>
+          <w:tab w:val="left" w:pos="3360"/>
+          <w:tab w:val="left" w:pos="3920"/>
+          <w:tab w:val="left" w:pos="4480"/>
+          <w:tab w:val="left" w:pos="5040"/>
+          <w:tab w:val="left" w:pos="5600"/>
+          <w:tab w:val="left" w:pos="6160"/>
+          <w:tab w:val="left" w:pos="6720"/>
+        </w:tabs>
+        <w:autoSpaceDE w:val="0"/>
+        <w:autoSpaceDN w:val="0"/>
+        <w:adjustRightInd w:val="0"/>
+        <w:rPr>
+          <w:rFonts w:ascii="Menlo" w:eastAsiaTheme="minorHAnsi" w:hAnsi="Menlo" w:cs="Menlo"/>
+          <w:color w:val="000000"/>
+          <w:sz w:val="22"/>
+          <w:szCs w:val="22"/>
+          <w:lang w:val="en-GB" w:eastAsia="en-US"/>
+          <w14:ligatures w14:val="standardContextual"/>
+        </w:rPr>
+      </w:pPr>
+      <w:r>
+        <w:rPr>
+          <w:rFonts w:ascii="Menlo" w:eastAsiaTheme="minorHAnsi" w:hAnsi="Menlo" w:cs="Menlo"/>
+          <w:color w:val="000000"/>
+          <w:sz w:val="22"/>
+          <w:szCs w:val="22"/>
+          <w:lang w:val="en-GB" w:eastAsia="en-US"/>
+          <w14:ligatures w14:val="standardContextual"/>
+        </w:rPr>
+        <w:t xml:space="preserve">  Data/raw/</w:t>
+      </w:r>
+      <w:proofErr w:type="spellStart"/>
+      <w:r>
+        <w:rPr>
+          <w:rFonts w:ascii="Menlo" w:eastAsiaTheme="minorHAnsi" w:hAnsi="Menlo" w:cs="Menlo"/>
+          <w:color w:val="000000"/>
+          <w:sz w:val="22"/>
+          <w:szCs w:val="22"/>
+          <w:lang w:val="en-GB" w:eastAsia="en-US"/>
+          <w14:ligatures w14:val="standardContextual"/>
+        </w:rPr>
+        <w:t>baseline_geography</w:t>
+      </w:r>
+      <w:proofErr w:type="spellEnd"/>
+      <w:r>
+        <w:rPr>
+          <w:rFonts w:ascii="Menlo" w:eastAsiaTheme="minorHAnsi" w:hAnsi="Menlo" w:cs="Menlo"/>
+          <w:color w:val="000000"/>
+          <w:sz w:val="22"/>
+          <w:szCs w:val="22"/>
+          <w:lang w:val="en-GB" w:eastAsia="en-US"/>
+          <w14:ligatures w14:val="standardContextual"/>
+        </w:rPr>
+        <w:t>/</w:t>
+      </w:r>
+      <w:proofErr w:type="spellStart"/>
+      <w:r>
+        <w:rPr>
+          <w:rFonts w:ascii="Menlo" w:eastAsiaTheme="minorHAnsi" w:hAnsi="Menlo" w:cs="Menlo"/>
+          <w:color w:val="000000"/>
+          <w:sz w:val="22"/>
+          <w:szCs w:val="22"/>
+          <w:lang w:val="en-GB" w:eastAsia="en-US"/>
+          <w14:ligatures w14:val="standardContextual"/>
+        </w:rPr>
+        <w:t>cepf_hotspots.geojson</w:t>
+      </w:r>
+      <w:proofErr w:type="spellEnd"/>
+    </w:p>
+    <w:p>
+      <w:pPr>
+        <w:tabs>
+          <w:tab w:val="left" w:pos="560"/>
+          <w:tab w:val="left" w:pos="1120"/>
+          <w:tab w:val="left" w:pos="1680"/>
+          <w:tab w:val="left" w:pos="2240"/>
+          <w:tab w:val="left" w:pos="2800"/>
+          <w:tab w:val="left" w:pos="3360"/>
+          <w:tab w:val="left" w:pos="3920"/>
+          <w:tab w:val="left" w:pos="4480"/>
+          <w:tab w:val="left" w:pos="5040"/>
+          <w:tab w:val="left" w:pos="5600"/>
+          <w:tab w:val="left" w:pos="6160"/>
+          <w:tab w:val="left" w:pos="6720"/>
+        </w:tabs>
+        <w:autoSpaceDE w:val="0"/>
+        <w:autoSpaceDN w:val="0"/>
+        <w:adjustRightInd w:val="0"/>
+        <w:rPr>
+          <w:rFonts w:ascii="Menlo" w:eastAsiaTheme="minorHAnsi" w:hAnsi="Menlo" w:cs="Menlo"/>
+          <w:color w:val="000000"/>
+          <w:sz w:val="22"/>
+          <w:szCs w:val="22"/>
+          <w:lang w:val="en-GB" w:eastAsia="en-US"/>
+          <w14:ligatures w14:val="standardContextual"/>
+        </w:rPr>
+      </w:pPr>
+    </w:p>
+    <w:p>
+      <w:pPr>
+        <w:tabs>
+          <w:tab w:val="left" w:pos="560"/>
+          <w:tab w:val="left" w:pos="1120"/>
+          <w:tab w:val="left" w:pos="1680"/>
+          <w:tab w:val="left" w:pos="2240"/>
+          <w:tab w:val="left" w:pos="2800"/>
+          <w:tab w:val="left" w:pos="3360"/>
+          <w:tab w:val="left" w:pos="3920"/>
+          <w:tab w:val="left" w:pos="4480"/>
+          <w:tab w:val="left" w:pos="5040"/>
+          <w:tab w:val="left" w:pos="5600"/>
+          <w:tab w:val="left" w:pos="6160"/>
+          <w:tab w:val="left" w:pos="6720"/>
+        </w:tabs>
+        <w:autoSpaceDE w:val="0"/>
+        <w:autoSpaceDN w:val="0"/>
+        <w:adjustRightInd w:val="0"/>
+        <w:rPr>
+          <w:rFonts w:ascii="Menlo" w:eastAsiaTheme="minorHAnsi" w:hAnsi="Menlo" w:cs="Menlo"/>
+          <w:color w:val="000000"/>
+          <w:sz w:val="22"/>
+          <w:szCs w:val="22"/>
+          <w:lang w:val="en-GB" w:eastAsia="en-US"/>
+          <w14:ligatures w14:val="standardContextual"/>
+        </w:rPr>
+      </w:pPr>
+      <w:r>
+        <w:rPr>
+          <w:rFonts w:ascii="Menlo" w:eastAsiaTheme="minorHAnsi" w:hAnsi="Menlo" w:cs="Menlo"/>
+          <w:color w:val="000000"/>
+          <w:sz w:val="22"/>
+          <w:szCs w:val="22"/>
+          <w:lang w:val="en-GB" w:eastAsia="en-US"/>
+          <w14:ligatures w14:val="standardContextual"/>
+        </w:rPr>
+        <w:t xml:space="preserve">  I downloaded this from the CEPF / Conservation International ArcGIS hosted hotspot layer. It contains 36</w:t>
+      </w:r>
+    </w:p>
+    <w:p>
+      <w:pPr>
+        <w:tabs>
+          <w:tab w:val="left" w:pos="560"/>
+          <w:tab w:val="left" w:pos="1120"/>
+          <w:tab w:val="left" w:pos="1680"/>
+          <w:tab w:val="left" w:pos="2240"/>
+          <w:tab w:val="left" w:pos="2800"/>
+          <w:tab w:val="left" w:pos="3360"/>
+          <w:tab w:val="left" w:pos="3920"/>
+          <w:tab w:val="left" w:pos="4480"/>
+          <w:tab w:val="left" w:pos="5040"/>
+          <w:tab w:val="left" w:pos="5600"/>
+          <w:tab w:val="left" w:pos="6160"/>
+          <w:tab w:val="left" w:pos="6720"/>
+        </w:tabs>
+        <w:autoSpaceDE w:val="0"/>
+        <w:autoSpaceDN w:val="0"/>
+        <w:adjustRightInd w:val="0"/>
+        <w:rPr>
+          <w:rFonts w:ascii="Menlo" w:eastAsiaTheme="minorHAnsi" w:hAnsi="Menlo" w:cs="Menlo"/>
+          <w:color w:val="000000"/>
+          <w:sz w:val="22"/>
+          <w:szCs w:val="22"/>
+          <w:lang w:val="en-GB" w:eastAsia="en-US"/>
+          <w14:ligatures w14:val="standardContextual"/>
+        </w:rPr>
+      </w:pPr>
+      <w:r>
+        <w:rPr>
+          <w:rFonts w:ascii="Menlo" w:eastAsiaTheme="minorHAnsi" w:hAnsi="Menlo" w:cs="Menlo"/>
+          <w:color w:val="000000"/>
+          <w:sz w:val="22"/>
+          <w:szCs w:val="22"/>
+          <w:lang w:val="en-GB" w:eastAsia="en-US"/>
+          <w14:ligatures w14:val="standardContextual"/>
+        </w:rPr>
+        <w:t xml:space="preserve">  biodiversity hotspot polygons.</w:t>
+      </w:r>
+    </w:p>
+    <w:p>
+      <w:pPr>
+        <w:tabs>
+          <w:tab w:val="left" w:pos="560"/>
+          <w:tab w:val="left" w:pos="1120"/>
+          <w:tab w:val="left" w:pos="1680"/>
+          <w:tab w:val="left" w:pos="2240"/>
+          <w:tab w:val="left" w:pos="2800"/>
+          <w:tab w:val="left" w:pos="3360"/>
+          <w:tab w:val="left" w:pos="3920"/>
+          <w:tab w:val="left" w:pos="4480"/>
+          <w:tab w:val="left" w:pos="5040"/>
+          <w:tab w:val="left" w:pos="5600"/>
+          <w:tab w:val="left" w:pos="6160"/>
+          <w:tab w:val="left" w:pos="6720"/>
+        </w:tabs>
+        <w:autoSpaceDE w:val="0"/>
+        <w:autoSpaceDN w:val="0"/>
+        <w:adjustRightInd w:val="0"/>
+        <w:rPr>
+          <w:rFonts w:ascii="Menlo" w:eastAsiaTheme="minorHAnsi" w:hAnsi="Menlo" w:cs="Menlo"/>
+          <w:color w:val="000000"/>
+          <w:sz w:val="22"/>
+          <w:szCs w:val="22"/>
+          <w:lang w:val="en-GB" w:eastAsia="en-US"/>
+          <w14:ligatures w14:val="standardContextual"/>
+        </w:rPr>
+      </w:pPr>
+    </w:p>
+    <w:p>
+      <w:pPr>
+        <w:tabs>
+          <w:tab w:val="left" w:pos="560"/>
+          <w:tab w:val="left" w:pos="1120"/>
+          <w:tab w:val="left" w:pos="1680"/>
+          <w:tab w:val="left" w:pos="2240"/>
+          <w:tab w:val="left" w:pos="2800"/>
+          <w:tab w:val="left" w:pos="3360"/>
+          <w:tab w:val="left" w:pos="3920"/>
+          <w:tab w:val="left" w:pos="4480"/>
+          <w:tab w:val="left" w:pos="5040"/>
+          <w:tab w:val="left" w:pos="5600"/>
+          <w:tab w:val="left" w:pos="6160"/>
+          <w:tab w:val="left" w:pos="6720"/>
+        </w:tabs>
+        <w:autoSpaceDE w:val="0"/>
+        <w:autoSpaceDN w:val="0"/>
+        <w:adjustRightInd w:val="0"/>
+        <w:rPr>
+          <w:rFonts w:ascii="Menlo" w:eastAsiaTheme="minorHAnsi" w:hAnsi="Menlo" w:cs="Menlo"/>
+          <w:color w:val="000000"/>
+          <w:sz w:val="22"/>
+          <w:szCs w:val="22"/>
+          <w:lang w:val="en-GB" w:eastAsia="en-US"/>
+          <w14:ligatures w14:val="standardContextual"/>
+        </w:rPr>
+      </w:pPr>
+      <w:r>
+        <w:rPr>
+          <w:rFonts w:ascii="Menlo" w:eastAsiaTheme="minorHAnsi" w:hAnsi="Menlo" w:cs="Menlo"/>
+          <w:color w:val="000000"/>
+          <w:sz w:val="22"/>
+          <w:szCs w:val="22"/>
+          <w:lang w:val="en-GB" w:eastAsia="en-US"/>
+          <w14:ligatures w14:val="standardContextual"/>
+        </w:rPr>
+        <w:t xml:space="preserve">  Both overlays also use our BOLD grid input:</w:t>
+      </w:r>
+    </w:p>
+    <w:p>
+      <w:pPr>
+        <w:tabs>
+          <w:tab w:val="left" w:pos="560"/>
+          <w:tab w:val="left" w:pos="1120"/>
+          <w:tab w:val="left" w:pos="1680"/>
+          <w:tab w:val="left" w:pos="2240"/>
+          <w:tab w:val="left" w:pos="2800"/>
+          <w:tab w:val="left" w:pos="3360"/>
+          <w:tab w:val="left" w:pos="3920"/>
+          <w:tab w:val="left" w:pos="4480"/>
+          <w:tab w:val="left" w:pos="5040"/>
+          <w:tab w:val="left" w:pos="5600"/>
+          <w:tab w:val="left" w:pos="6160"/>
+          <w:tab w:val="left" w:pos="6720"/>
+        </w:tabs>
+        <w:autoSpaceDE w:val="0"/>
+        <w:autoSpaceDN w:val="0"/>
+        <w:adjustRightInd w:val="0"/>
+        <w:rPr>
+          <w:rFonts w:ascii="Menlo" w:eastAsiaTheme="minorHAnsi" w:hAnsi="Menlo" w:cs="Menlo"/>
+          <w:color w:val="000000"/>
+          <w:sz w:val="22"/>
+          <w:szCs w:val="22"/>
+          <w:lang w:val="en-GB" w:eastAsia="en-US"/>
+          <w14:ligatures w14:val="standardContextual"/>
+        </w:rPr>
+      </w:pPr>
+    </w:p>
+    <w:p>
+      <w:pPr>
+        <w:tabs>
+          <w:tab w:val="left" w:pos="560"/>
+          <w:tab w:val="left" w:pos="1120"/>
+          <w:tab w:val="left" w:pos="1680"/>
+          <w:tab w:val="left" w:pos="2240"/>
+          <w:tab w:val="left" w:pos="2800"/>
+          <w:tab w:val="left" w:pos="3360"/>
+          <w:tab w:val="left" w:pos="3920"/>
+          <w:tab w:val="left" w:pos="4480"/>
+          <w:tab w:val="left" w:pos="5040"/>
+          <w:tab w:val="left" w:pos="5600"/>
+          <w:tab w:val="left" w:pos="6160"/>
+          <w:tab w:val="left" w:pos="6720"/>
+        </w:tabs>
+        <w:autoSpaceDE w:val="0"/>
+        <w:autoSpaceDN w:val="0"/>
+        <w:adjustRightInd w:val="0"/>
+        <w:rPr>
+          <w:rFonts w:ascii="Menlo" w:eastAsiaTheme="minorHAnsi" w:hAnsi="Menlo" w:cs="Menlo"/>
+          <w:color w:val="000000"/>
+          <w:sz w:val="22"/>
+          <w:szCs w:val="22"/>
+          <w:lang w:val="en-GB" w:eastAsia="en-US"/>
+          <w14:ligatures w14:val="standardContextual"/>
+        </w:rPr>
+      </w:pPr>
+      <w:r>
+        <w:rPr>
+          <w:rFonts w:ascii="Menlo" w:eastAsiaTheme="minorHAnsi" w:hAnsi="Menlo" w:cs="Menlo"/>
+          <w:color w:val="000000"/>
+          <w:sz w:val="22"/>
+          <w:szCs w:val="22"/>
+          <w:lang w:val="en-GB" w:eastAsia="en-US"/>
+          <w14:ligatures w14:val="standardContextual"/>
+        </w:rPr>
+        <w:t xml:space="preserve">  Exhibits/data/bold_grid100_land_cells.csv</w:t>
+      </w:r>
+    </w:p>
+    <w:p>
+      <w:pPr>
+        <w:tabs>
+          <w:tab w:val="left" w:pos="560"/>
+          <w:tab w:val="left" w:pos="1120"/>
+          <w:tab w:val="left" w:pos="1680"/>
+          <w:tab w:val="left" w:pos="2240"/>
+          <w:tab w:val="left" w:pos="2800"/>
+          <w:tab w:val="left" w:pos="3360"/>
+          <w:tab w:val="left" w:pos="3920"/>
+          <w:tab w:val="left" w:pos="4480"/>
+          <w:tab w:val="left" w:pos="5040"/>
+          <w:tab w:val="left" w:pos="5600"/>
+          <w:tab w:val="left" w:pos="6160"/>
+          <w:tab w:val="left" w:pos="6720"/>
+        </w:tabs>
+        <w:autoSpaceDE w:val="0"/>
+        <w:autoSpaceDN w:val="0"/>
+        <w:adjustRightInd w:val="0"/>
+        <w:rPr>
+          <w:rFonts w:ascii="Menlo" w:eastAsiaTheme="minorHAnsi" w:hAnsi="Menlo" w:cs="Menlo"/>
+          <w:color w:val="000000"/>
+          <w:sz w:val="22"/>
+          <w:szCs w:val="22"/>
+          <w:lang w:val="en-GB" w:eastAsia="en-US"/>
+          <w14:ligatures w14:val="standardContextual"/>
+        </w:rPr>
+      </w:pPr>
+    </w:p>
+    <w:p>
+      <w:pPr>
+        <w:tabs>
+          <w:tab w:val="left" w:pos="560"/>
+          <w:tab w:val="left" w:pos="1120"/>
+          <w:tab w:val="left" w:pos="1680"/>
+          <w:tab w:val="left" w:pos="2240"/>
+          <w:tab w:val="left" w:pos="2800"/>
+          <w:tab w:val="left" w:pos="3360"/>
+          <w:tab w:val="left" w:pos="3920"/>
+          <w:tab w:val="left" w:pos="4480"/>
+          <w:tab w:val="left" w:pos="5040"/>
+          <w:tab w:val="left" w:pos="5600"/>
+          <w:tab w:val="left" w:pos="6160"/>
+          <w:tab w:val="left" w:pos="6720"/>
+        </w:tabs>
+        <w:autoSpaceDE w:val="0"/>
+        <w:autoSpaceDN w:val="0"/>
+        <w:adjustRightInd w:val="0"/>
+        <w:rPr>
+          <w:rFonts w:ascii="Menlo" w:eastAsiaTheme="minorHAnsi" w:hAnsi="Menlo" w:cs="Menlo"/>
+          <w:color w:val="000000"/>
+          <w:sz w:val="22"/>
+          <w:szCs w:val="22"/>
+          <w:lang w:val="en-GB" w:eastAsia="en-US"/>
+          <w14:ligatures w14:val="standardContextual"/>
+        </w:rPr>
+      </w:pPr>
+      <w:r>
+        <w:rPr>
+          <w:rFonts w:ascii="Menlo" w:eastAsiaTheme="minorHAnsi" w:hAnsi="Menlo" w:cs="Menlo"/>
+          <w:color w:val="000000"/>
+          <w:sz w:val="22"/>
+          <w:szCs w:val="22"/>
+          <w:lang w:val="en-GB" w:eastAsia="en-US"/>
+          <w14:ligatures w14:val="standardContextual"/>
+        </w:rPr>
+        <w:t xml:space="preserve">  For WDPA, nothing was downloaded yet; that requires a separate Protected Planet download.</w:t>
+      </w:r>
+    </w:p>
+    <w:p>
+      <w:pPr>
+        <w:rPr>
+          <w:lang w:val="en-GB"/>
+        </w:rPr>
+      </w:pPr>
+    </w:p>
+    <w:p>
+      <w:pPr>
+        <w:rPr>
+          <w:lang w:val="en-GB"/>
+        </w:rPr>
+      </w:pPr>
+      <w:r>
+        <w:rPr>
+          <w:highlight w:val="yellow"/>
+          <w:lang w:val="en-GB"/>
+        </w:rPr>
+        <w:t>Claude</w:t>
+      </w:r>
+    </w:p>
+    <w:p>
+      <w:pPr>
+        <w:rPr>
+          <w:lang w:val="en-GB"/>
+        </w:rPr>
+      </w:pPr>
+    </w:p>
+    <w:p>
+      <w:pPr>
+        <w:tabs>
+          <w:tab w:val="left" w:pos="560"/>
+          <w:tab w:val="left" w:pos="1120"/>
+          <w:tab w:val="left" w:pos="1680"/>
+          <w:tab w:val="left" w:pos="2240"/>
+          <w:tab w:val="left" w:pos="2800"/>
+          <w:tab w:val="left" w:pos="3360"/>
+          <w:tab w:val="left" w:pos="3920"/>
+          <w:tab w:val="left" w:pos="4480"/>
+          <w:tab w:val="left" w:pos="5040"/>
+          <w:tab w:val="left" w:pos="5600"/>
+          <w:tab w:val="left" w:pos="6160"/>
+          <w:tab w:val="left" w:pos="6720"/>
+        </w:tabs>
+        <w:autoSpaceDE w:val="0"/>
+        <w:autoSpaceDN w:val="0"/>
+        <w:adjustRightInd w:val="0"/>
+        <w:rPr>
+          <w:rFonts w:ascii="Menlo" w:eastAsiaTheme="minorHAnsi" w:hAnsi="Menlo" w:cs="Menlo"/>
+          <w:color w:val="000000"/>
+          <w:sz w:val="22"/>
+          <w:szCs w:val="22"/>
+          <w:lang w:val="en-GB" w:eastAsia="en-US"/>
+          <w14:ligatures w14:val="standardContextual"/>
+        </w:rPr>
+      </w:pPr>
+      <w:r>
+        <w:rPr>
+          <w:rFonts w:ascii="Menlo" w:eastAsiaTheme="minorHAnsi" w:hAnsi="Menlo" w:cs="Menlo"/>
+          <w:color w:val="000000"/>
+          <w:sz w:val="22"/>
+          <w:szCs w:val="22"/>
+          <w:lang w:val="en-GB" w:eastAsia="en-US"/>
+          <w14:ligatures w14:val="standardContextual"/>
+        </w:rPr>
+        <w:t xml:space="preserve"> </w:t>
+      </w:r>
+      <w:r>
+        <w:rPr>
+          <w:rFonts w:ascii="Menlo" w:eastAsiaTheme="minorHAnsi" w:hAnsi="Menlo" w:cs="Menlo"/>
+          <w:b/>
+          <w:bCs/>
+          <w:color w:val="000000"/>
+          <w:sz w:val="22"/>
+          <w:szCs w:val="22"/>
+          <w:lang w:val="en-GB" w:eastAsia="en-US"/>
+          <w14:ligatures w14:val="standardContextual"/>
+        </w:rPr>
+        <w:t>Non-Earth-Engine additions</w:t>
+      </w:r>
+    </w:p>
+    <w:p>
+      <w:pPr>
+        <w:tabs>
+          <w:tab w:val="left" w:pos="560"/>
+          <w:tab w:val="left" w:pos="1120"/>
+          <w:tab w:val="left" w:pos="1680"/>
+          <w:tab w:val="left" w:pos="2240"/>
+          <w:tab w:val="left" w:pos="2800"/>
+          <w:tab w:val="left" w:pos="3360"/>
+          <w:tab w:val="left" w:pos="3920"/>
+          <w:tab w:val="left" w:pos="4480"/>
+          <w:tab w:val="left" w:pos="5040"/>
+          <w:tab w:val="left" w:pos="5600"/>
+          <w:tab w:val="left" w:pos="6160"/>
+          <w:tab w:val="left" w:pos="6720"/>
+        </w:tabs>
+        <w:autoSpaceDE w:val="0"/>
+        <w:autoSpaceDN w:val="0"/>
+        <w:adjustRightInd w:val="0"/>
+        <w:rPr>
+          <w:rFonts w:ascii="Menlo" w:eastAsiaTheme="minorHAnsi" w:hAnsi="Menlo" w:cs="Menlo"/>
+          <w:color w:val="000000"/>
+          <w:sz w:val="22"/>
+          <w:szCs w:val="22"/>
+          <w:lang w:val="en-GB" w:eastAsia="en-US"/>
+          <w14:ligatures w14:val="standardContextual"/>
+        </w:rPr>
+      </w:pPr>
+      <w:r>
+        <w:rPr>
+          <w:rFonts w:ascii="Menlo" w:eastAsiaTheme="minorHAnsi" w:hAnsi="Menlo" w:cs="Menlo"/>
+          <w:color w:val="000000"/>
+          <w:sz w:val="22"/>
+          <w:szCs w:val="22"/>
+          <w:lang w:val="en-GB" w:eastAsia="en-US"/>
+          <w14:ligatures w14:val="standardContextual"/>
+        </w:rPr>
+        <w:t xml:space="preserve">     Good candidates:</w:t>
+      </w:r>
+    </w:p>
+    <w:p>
+      <w:pPr>
+        <w:tabs>
+          <w:tab w:val="left" w:pos="560"/>
+          <w:tab w:val="left" w:pos="1120"/>
+          <w:tab w:val="left" w:pos="1680"/>
+          <w:tab w:val="left" w:pos="2240"/>
+          <w:tab w:val="left" w:pos="2800"/>
+          <w:tab w:val="left" w:pos="3360"/>
+          <w:tab w:val="left" w:pos="3920"/>
+          <w:tab w:val="left" w:pos="4480"/>
+          <w:tab w:val="left" w:pos="5040"/>
+          <w:tab w:val="left" w:pos="5600"/>
+          <w:tab w:val="left" w:pos="6160"/>
+          <w:tab w:val="left" w:pos="6720"/>
+        </w:tabs>
+        <w:autoSpaceDE w:val="0"/>
+        <w:autoSpaceDN w:val="0"/>
+        <w:adjustRightInd w:val="0"/>
+        <w:rPr>
+          <w:rFonts w:ascii="Menlo" w:eastAsiaTheme="minorHAnsi" w:hAnsi="Menlo" w:cs="Menlo"/>
+          <w:color w:val="000000"/>
+          <w:sz w:val="22"/>
+          <w:szCs w:val="22"/>
+          <w:lang w:val="en-GB" w:eastAsia="en-US"/>
+          <w14:ligatures w14:val="standardContextual"/>
+        </w:rPr>
+      </w:pPr>
+      <w:r>
+        <w:rPr>
+          <w:rFonts w:ascii="Menlo" w:eastAsiaTheme="minorHAnsi" w:hAnsi="Menlo" w:cs="Menlo"/>
+          <w:color w:val="000000"/>
+          <w:sz w:val="22"/>
+          <w:szCs w:val="22"/>
+          <w:lang w:val="en-GB" w:eastAsia="en-US"/>
+          <w14:ligatures w14:val="standardContextual"/>
+        </w:rPr>
+        <w:t xml:space="preserve">      - </w:t>
+      </w:r>
+      <w:proofErr w:type="spellStart"/>
+      <w:r>
+        <w:rPr>
+          <w:rFonts w:ascii="Menlo" w:eastAsiaTheme="minorHAnsi" w:hAnsi="Menlo" w:cs="Menlo"/>
+          <w:color w:val="000000"/>
+          <w:sz w:val="22"/>
+          <w:szCs w:val="22"/>
+          <w:lang w:val="en-GB" w:eastAsia="en-US"/>
+          <w14:ligatures w14:val="standardContextual"/>
+        </w:rPr>
+        <w:t>TerraClimate</w:t>
+      </w:r>
+      <w:proofErr w:type="spellEnd"/>
+      <w:r>
+        <w:rPr>
+          <w:rFonts w:ascii="Menlo" w:eastAsiaTheme="minorHAnsi" w:hAnsi="Menlo" w:cs="Menlo"/>
+          <w:color w:val="000000"/>
+          <w:sz w:val="22"/>
+          <w:szCs w:val="22"/>
+          <w:lang w:val="en-GB" w:eastAsia="en-US"/>
+          <w14:ligatures w14:val="standardContextual"/>
+        </w:rPr>
+        <w:t xml:space="preserve"> climate anomalies, local </w:t>
+      </w:r>
+      <w:proofErr w:type="spellStart"/>
+      <w:r>
+        <w:rPr>
+          <w:rFonts w:ascii="Menlo" w:eastAsiaTheme="minorHAnsi" w:hAnsi="Menlo" w:cs="Menlo"/>
+          <w:color w:val="000000"/>
+          <w:sz w:val="22"/>
+          <w:szCs w:val="22"/>
+          <w:lang w:val="en-GB" w:eastAsia="en-US"/>
+          <w14:ligatures w14:val="standardContextual"/>
+        </w:rPr>
+        <w:t>NetCDF</w:t>
+      </w:r>
+      <w:proofErr w:type="spellEnd"/>
+      <w:r>
+        <w:rPr>
+          <w:rFonts w:ascii="Menlo" w:eastAsiaTheme="minorHAnsi" w:hAnsi="Menlo" w:cs="Menlo"/>
+          <w:color w:val="000000"/>
+          <w:sz w:val="22"/>
+          <w:szCs w:val="22"/>
+          <w:lang w:val="en-GB" w:eastAsia="en-US"/>
+          <w14:ligatures w14:val="standardContextual"/>
+        </w:rPr>
+        <w:t xml:space="preserve"> download.</w:t>
+      </w:r>
+    </w:p>
+    <w:p>
+      <w:pPr>
+        <w:tabs>
+          <w:tab w:val="left" w:pos="560"/>
+          <w:tab w:val="left" w:pos="1120"/>
+          <w:tab w:val="left" w:pos="1680"/>
+          <w:tab w:val="left" w:pos="2240"/>
+          <w:tab w:val="left" w:pos="2800"/>
+          <w:tab w:val="left" w:pos="3360"/>
+          <w:tab w:val="left" w:pos="3920"/>
+          <w:tab w:val="left" w:pos="4480"/>
+          <w:tab w:val="left" w:pos="5040"/>
+          <w:tab w:val="left" w:pos="5600"/>
+          <w:tab w:val="left" w:pos="6160"/>
+          <w:tab w:val="left" w:pos="6720"/>
+        </w:tabs>
+        <w:autoSpaceDE w:val="0"/>
+        <w:autoSpaceDN w:val="0"/>
+        <w:adjustRightInd w:val="0"/>
+        <w:rPr>
+          <w:rFonts w:ascii="Menlo" w:eastAsiaTheme="minorHAnsi" w:hAnsi="Menlo" w:cs="Menlo"/>
+          <w:color w:val="000000"/>
+          <w:sz w:val="22"/>
+          <w:szCs w:val="22"/>
+          <w:lang w:val="en-GB" w:eastAsia="en-US"/>
+          <w14:ligatures w14:val="standardContextual"/>
+        </w:rPr>
+      </w:pPr>
+      <w:r>
+        <w:rPr>
+          <w:rFonts w:ascii="Menlo" w:eastAsiaTheme="minorHAnsi" w:hAnsi="Menlo" w:cs="Menlo"/>
+          <w:color w:val="000000"/>
+          <w:sz w:val="22"/>
+          <w:szCs w:val="22"/>
+          <w:lang w:val="en-GB" w:eastAsia="en-US"/>
+          <w14:ligatures w14:val="standardContextual"/>
+        </w:rPr>
+        <w:t xml:space="preserve">      - CHIRPS precipitation anomalies, local/ERDDAP download.</w:t>
+      </w:r>
+    </w:p>
+    <w:p>
+      <w:pPr>
+        <w:tabs>
+          <w:tab w:val="left" w:pos="560"/>
+          <w:tab w:val="left" w:pos="1120"/>
+          <w:tab w:val="left" w:pos="1680"/>
+          <w:tab w:val="left" w:pos="2240"/>
+          <w:tab w:val="left" w:pos="2800"/>
+          <w:tab w:val="left" w:pos="3360"/>
+          <w:tab w:val="left" w:pos="3920"/>
+          <w:tab w:val="left" w:pos="4480"/>
+          <w:tab w:val="left" w:pos="5040"/>
+          <w:tab w:val="left" w:pos="5600"/>
+          <w:tab w:val="left" w:pos="6160"/>
+          <w:tab w:val="left" w:pos="6720"/>
+        </w:tabs>
+        <w:autoSpaceDE w:val="0"/>
+        <w:autoSpaceDN w:val="0"/>
+        <w:adjustRightInd w:val="0"/>
+        <w:rPr>
+          <w:rFonts w:ascii="Menlo" w:eastAsiaTheme="minorHAnsi" w:hAnsi="Menlo" w:cs="Menlo"/>
+          <w:color w:val="000000"/>
+          <w:sz w:val="22"/>
+          <w:szCs w:val="22"/>
+          <w:lang w:val="en-GB" w:eastAsia="en-US"/>
+          <w14:ligatures w14:val="standardContextual"/>
+        </w:rPr>
+      </w:pPr>
+    </w:p>
+    <w:p>
+      <w:pPr>
+        <w:tabs>
+          <w:tab w:val="left" w:pos="560"/>
+          <w:tab w:val="left" w:pos="1120"/>
+          <w:tab w:val="left" w:pos="1680"/>
+          <w:tab w:val="left" w:pos="2240"/>
+          <w:tab w:val="left" w:pos="2800"/>
+          <w:tab w:val="left" w:pos="3360"/>
+          <w:tab w:val="left" w:pos="3920"/>
+          <w:tab w:val="left" w:pos="4480"/>
+          <w:tab w:val="left" w:pos="5040"/>
+          <w:tab w:val="left" w:pos="5600"/>
+          <w:tab w:val="left" w:pos="6160"/>
+          <w:tab w:val="left" w:pos="6720"/>
+        </w:tabs>
+        <w:autoSpaceDE w:val="0"/>
+        <w:autoSpaceDN w:val="0"/>
+        <w:adjustRightInd w:val="0"/>
+        <w:rPr>
+          <w:rFonts w:ascii="Menlo" w:eastAsiaTheme="minorHAnsi" w:hAnsi="Menlo" w:cs="Menlo"/>
+          <w:color w:val="000000"/>
+          <w:sz w:val="22"/>
+          <w:szCs w:val="22"/>
+          <w:lang w:val="en-GB" w:eastAsia="en-US"/>
+          <w14:ligatures w14:val="standardContextual"/>
+        </w:rPr>
+      </w:pPr>
+      <w:r>
+        <w:rPr>
+          <w:rFonts w:ascii="Menlo" w:eastAsiaTheme="minorHAnsi" w:hAnsi="Menlo" w:cs="Menlo"/>
+          <w:color w:val="000000"/>
+          <w:sz w:val="22"/>
+          <w:szCs w:val="22"/>
+          <w:lang w:val="en-GB" w:eastAsia="en-US"/>
+          <w14:ligatures w14:val="standardContextual"/>
+        </w:rPr>
+        <w:t xml:space="preserve">      - GADM/admin geography, if we want admin controls.</w:t>
+      </w:r>
+    </w:p>
+    <w:p>
+      <w:pPr>
+        <w:tabs>
+          <w:tab w:val="left" w:pos="560"/>
+          <w:tab w:val="left" w:pos="1120"/>
+          <w:tab w:val="left" w:pos="1680"/>
+          <w:tab w:val="left" w:pos="2240"/>
+          <w:tab w:val="left" w:pos="2800"/>
+          <w:tab w:val="left" w:pos="3360"/>
+          <w:tab w:val="left" w:pos="3920"/>
+          <w:tab w:val="left" w:pos="4480"/>
+          <w:tab w:val="left" w:pos="5040"/>
+          <w:tab w:val="left" w:pos="5600"/>
+          <w:tab w:val="left" w:pos="6160"/>
+          <w:tab w:val="left" w:pos="6720"/>
+        </w:tabs>
+        <w:autoSpaceDE w:val="0"/>
+        <w:autoSpaceDN w:val="0"/>
+        <w:adjustRightInd w:val="0"/>
+        <w:rPr>
+          <w:rFonts w:ascii="Menlo" w:eastAsiaTheme="minorHAnsi" w:hAnsi="Menlo" w:cs="Menlo"/>
+          <w:color w:val="000000"/>
+          <w:sz w:val="22"/>
+          <w:szCs w:val="22"/>
+          <w:lang w:val="en-GB" w:eastAsia="en-US"/>
+          <w14:ligatures w14:val="standardContextual"/>
+        </w:rPr>
+      </w:pPr>
+      <w:r>
+        <w:rPr>
+          <w:rFonts w:ascii="Menlo" w:eastAsiaTheme="minorHAnsi" w:hAnsi="Menlo" w:cs="Menlo"/>
+          <w:color w:val="000000"/>
+          <w:sz w:val="22"/>
+          <w:szCs w:val="22"/>
+          <w:lang w:val="en-GB" w:eastAsia="en-US"/>
+          <w14:ligatures w14:val="standardContextual"/>
+        </w:rPr>
+        <w:t xml:space="preserve">      - </w:t>
+      </w:r>
+      <w:proofErr w:type="spellStart"/>
+      <w:r>
+        <w:rPr>
+          <w:rFonts w:ascii="Menlo" w:eastAsiaTheme="minorHAnsi" w:hAnsi="Menlo" w:cs="Menlo"/>
+          <w:color w:val="000000"/>
+          <w:sz w:val="22"/>
+          <w:szCs w:val="22"/>
+          <w:lang w:val="en-GB" w:eastAsia="en-US"/>
+          <w14:ligatures w14:val="standardContextual"/>
+        </w:rPr>
+        <w:t>gROADS</w:t>
+      </w:r>
+      <w:proofErr w:type="spellEnd"/>
+      <w:r>
+        <w:rPr>
+          <w:rFonts w:ascii="Menlo" w:eastAsiaTheme="minorHAnsi" w:hAnsi="Menlo" w:cs="Menlo"/>
+          <w:color w:val="000000"/>
+          <w:sz w:val="22"/>
+          <w:szCs w:val="22"/>
+          <w:lang w:val="en-GB" w:eastAsia="en-US"/>
+          <w14:ligatures w14:val="standardContextual"/>
+        </w:rPr>
+        <w:t xml:space="preserve"> or other road/accessibility baseline.</w:t>
+      </w:r>
+    </w:p>
+    <w:p>
+      <w:pPr>
+        <w:tabs>
+          <w:tab w:val="left" w:pos="560"/>
+          <w:tab w:val="left" w:pos="1120"/>
+          <w:tab w:val="left" w:pos="1680"/>
+          <w:tab w:val="left" w:pos="2240"/>
+          <w:tab w:val="left" w:pos="2800"/>
+          <w:tab w:val="left" w:pos="3360"/>
+          <w:tab w:val="left" w:pos="3920"/>
+          <w:tab w:val="left" w:pos="4480"/>
+          <w:tab w:val="left" w:pos="5040"/>
+          <w:tab w:val="left" w:pos="5600"/>
+          <w:tab w:val="left" w:pos="6160"/>
+          <w:tab w:val="left" w:pos="6720"/>
+        </w:tabs>
+        <w:autoSpaceDE w:val="0"/>
+        <w:autoSpaceDN w:val="0"/>
+        <w:adjustRightInd w:val="0"/>
+        <w:rPr>
+          <w:rFonts w:ascii="Menlo" w:eastAsiaTheme="minorHAnsi" w:hAnsi="Menlo" w:cs="Menlo"/>
+          <w:color w:val="000000"/>
+          <w:sz w:val="22"/>
+          <w:szCs w:val="22"/>
+          <w:lang w:val="en-GB" w:eastAsia="en-US"/>
+          <w14:ligatures w14:val="standardContextual"/>
+        </w:rPr>
+      </w:pPr>
+    </w:p>
+    <w:p>
+      <w:pPr>
+        <w:tabs>
+          <w:tab w:val="left" w:pos="560"/>
+          <w:tab w:val="left" w:pos="1120"/>
+          <w:tab w:val="left" w:pos="1680"/>
+          <w:tab w:val="left" w:pos="2240"/>
+          <w:tab w:val="left" w:pos="2800"/>
+          <w:tab w:val="left" w:pos="3360"/>
+          <w:tab w:val="left" w:pos="3920"/>
+          <w:tab w:val="left" w:pos="4480"/>
+          <w:tab w:val="left" w:pos="5040"/>
+          <w:tab w:val="left" w:pos="5600"/>
+          <w:tab w:val="left" w:pos="6160"/>
+          <w:tab w:val="left" w:pos="6720"/>
+        </w:tabs>
+        <w:autoSpaceDE w:val="0"/>
+        <w:autoSpaceDN w:val="0"/>
+        <w:adjustRightInd w:val="0"/>
+        <w:rPr>
+          <w:rFonts w:ascii="Menlo" w:eastAsiaTheme="minorHAnsi" w:hAnsi="Menlo" w:cs="Menlo"/>
+          <w:color w:val="000000"/>
+          <w:sz w:val="22"/>
+          <w:szCs w:val="22"/>
+          <w:lang w:val="en-GB" w:eastAsia="en-US"/>
+          <w14:ligatures w14:val="standardContextual"/>
+        </w:rPr>
+      </w:pPr>
+      <w:r>
+        <w:rPr>
+          <w:rFonts w:ascii="Menlo" w:eastAsiaTheme="minorHAnsi" w:hAnsi="Menlo" w:cs="Menlo"/>
+          <w:color w:val="000000"/>
+          <w:sz w:val="22"/>
+          <w:szCs w:val="22"/>
+          <w:lang w:val="en-GB" w:eastAsia="en-US"/>
+          <w14:ligatures w14:val="standardContextual"/>
+        </w:rPr>
+        <w:t xml:space="preserve">      - BII / GLOBIO / richness </w:t>
+      </w:r>
+      <w:proofErr w:type="spellStart"/>
+      <w:r>
+        <w:rPr>
+          <w:rFonts w:ascii="Menlo" w:eastAsiaTheme="minorHAnsi" w:hAnsi="Menlo" w:cs="Menlo"/>
+          <w:color w:val="000000"/>
+          <w:sz w:val="22"/>
+          <w:szCs w:val="22"/>
+          <w:lang w:val="en-GB" w:eastAsia="en-US"/>
+          <w14:ligatures w14:val="standardContextual"/>
+        </w:rPr>
+        <w:t>rasters</w:t>
+      </w:r>
+      <w:proofErr w:type="spellEnd"/>
+      <w:r>
+        <w:rPr>
+          <w:rFonts w:ascii="Menlo" w:eastAsiaTheme="minorHAnsi" w:hAnsi="Menlo" w:cs="Menlo"/>
+          <w:color w:val="000000"/>
+          <w:sz w:val="22"/>
+          <w:szCs w:val="22"/>
+          <w:lang w:val="en-GB" w:eastAsia="en-US"/>
+          <w14:ligatures w14:val="standardContextual"/>
+        </w:rPr>
+        <w:t xml:space="preserve"> if downloadable as static </w:t>
+      </w:r>
+      <w:proofErr w:type="spellStart"/>
+      <w:r>
+        <w:rPr>
+          <w:rFonts w:ascii="Menlo" w:eastAsiaTheme="minorHAnsi" w:hAnsi="Menlo" w:cs="Menlo"/>
+          <w:color w:val="000000"/>
+          <w:sz w:val="22"/>
+          <w:szCs w:val="22"/>
+          <w:lang w:val="en-GB" w:eastAsia="en-US"/>
+          <w14:ligatures w14:val="standardContextual"/>
+        </w:rPr>
+        <w:t>rasters</w:t>
+      </w:r>
+      <w:proofErr w:type="spellEnd"/>
+      <w:r>
+        <w:rPr>
+          <w:rFonts w:ascii="Menlo" w:eastAsiaTheme="minorHAnsi" w:hAnsi="Menlo" w:cs="Menlo"/>
+          <w:color w:val="000000"/>
+          <w:sz w:val="22"/>
+          <w:szCs w:val="22"/>
+          <w:lang w:val="en-GB" w:eastAsia="en-US"/>
+          <w14:ligatures w14:val="standardContextual"/>
+        </w:rPr>
+        <w:t>.</w:t>
+      </w:r>
+    </w:p>
+    <w:p>
+      <w:pPr>
+        <w:tabs>
+          <w:tab w:val="left" w:pos="560"/>
+          <w:tab w:val="left" w:pos="1120"/>
+          <w:tab w:val="left" w:pos="1680"/>
+          <w:tab w:val="left" w:pos="2240"/>
+          <w:tab w:val="left" w:pos="2800"/>
+          <w:tab w:val="left" w:pos="3360"/>
+          <w:tab w:val="left" w:pos="3920"/>
+          <w:tab w:val="left" w:pos="4480"/>
+          <w:tab w:val="left" w:pos="5040"/>
+          <w:tab w:val="left" w:pos="5600"/>
+          <w:tab w:val="left" w:pos="6160"/>
+          <w:tab w:val="left" w:pos="6720"/>
+        </w:tabs>
+        <w:autoSpaceDE w:val="0"/>
+        <w:autoSpaceDN w:val="0"/>
+        <w:adjustRightInd w:val="0"/>
+        <w:rPr>
+          <w:rFonts w:ascii="Menlo" w:eastAsiaTheme="minorHAnsi" w:hAnsi="Menlo" w:cs="Menlo"/>
+          <w:color w:val="000000"/>
+          <w:sz w:val="22"/>
+          <w:szCs w:val="22"/>
+          <w:lang w:val="en-GB" w:eastAsia="en-US"/>
+          <w14:ligatures w14:val="standardContextual"/>
+        </w:rPr>
+      </w:pPr>
+    </w:p>
+    <w:p>
+      <w:pPr>
+        <w:tabs>
+          <w:tab w:val="left" w:pos="560"/>
+          <w:tab w:val="left" w:pos="1120"/>
+          <w:tab w:val="left" w:pos="1680"/>
+          <w:tab w:val="left" w:pos="2240"/>
+          <w:tab w:val="left" w:pos="2800"/>
+          <w:tab w:val="left" w:pos="3360"/>
+          <w:tab w:val="left" w:pos="3920"/>
+          <w:tab w:val="left" w:pos="4480"/>
+          <w:tab w:val="left" w:pos="5040"/>
+          <w:tab w:val="left" w:pos="5600"/>
+          <w:tab w:val="left" w:pos="6160"/>
+          <w:tab w:val="left" w:pos="6720"/>
+        </w:tabs>
+        <w:autoSpaceDE w:val="0"/>
+        <w:autoSpaceDN w:val="0"/>
+        <w:adjustRightInd w:val="0"/>
+        <w:rPr>
+          <w:rFonts w:ascii="Menlo" w:eastAsiaTheme="minorHAnsi" w:hAnsi="Menlo" w:cs="Menlo"/>
+          <w:color w:val="000000"/>
+          <w:sz w:val="22"/>
+          <w:szCs w:val="22"/>
+          <w:lang w:val="en-GB" w:eastAsia="en-US"/>
+          <w14:ligatures w14:val="standardContextual"/>
+        </w:rPr>
+      </w:pPr>
+      <w:r>
+        <w:rPr>
+          <w:rFonts w:ascii="Menlo" w:eastAsiaTheme="minorHAnsi" w:hAnsi="Menlo" w:cs="Menlo"/>
+          <w:b/>
+          <w:bCs/>
+          <w:color w:val="000000"/>
+          <w:sz w:val="22"/>
+          <w:szCs w:val="22"/>
+          <w:lang w:val="en-GB" w:eastAsia="en-US"/>
+          <w14:ligatures w14:val="standardContextual"/>
+        </w:rPr>
+        <w:t>BII (Biodiversity Intactness Index)</w:t>
+      </w:r>
+      <w:r>
+        <w:rPr>
+          <w:rFonts w:ascii="Menlo" w:eastAsiaTheme="minorHAnsi" w:hAnsi="Menlo" w:cs="Menlo"/>
+          <w:color w:val="000000"/>
+          <w:sz w:val="22"/>
+          <w:szCs w:val="22"/>
+          <w:lang w:val="en-GB" w:eastAsia="en-US"/>
+          <w14:ligatures w14:val="standardContextual"/>
+        </w:rPr>
+        <w:t xml:space="preserve"> — </w:t>
+      </w:r>
+      <w:proofErr w:type="spellStart"/>
+      <w:r>
+        <w:rPr>
+          <w:rFonts w:ascii="Menlo" w:eastAsiaTheme="minorHAnsi" w:hAnsi="Menlo" w:cs="Menlo"/>
+          <w:color w:val="000000"/>
+          <w:sz w:val="22"/>
+          <w:szCs w:val="22"/>
+          <w:lang w:val="en-GB" w:eastAsia="en-US"/>
+          <w14:ligatures w14:val="standardContextual"/>
+        </w:rPr>
+        <w:t>Modeled</w:t>
+      </w:r>
+      <w:proofErr w:type="spellEnd"/>
+      <w:r>
+        <w:rPr>
+          <w:rFonts w:ascii="Menlo" w:eastAsiaTheme="minorHAnsi" w:hAnsi="Menlo" w:cs="Menlo"/>
+          <w:color w:val="000000"/>
+          <w:sz w:val="22"/>
+          <w:szCs w:val="22"/>
+          <w:lang w:val="en-GB" w:eastAsia="en-US"/>
+          <w14:ligatures w14:val="standardContextual"/>
+        </w:rPr>
+        <w:t xml:space="preserve"> local biodiversity intactness based on land use and other    </w:t>
+      </w:r>
+    </w:p>
+    <w:p>
+      <w:pPr>
+        <w:tabs>
+          <w:tab w:val="left" w:pos="560"/>
+          <w:tab w:val="left" w:pos="1120"/>
+          <w:tab w:val="left" w:pos="1680"/>
+          <w:tab w:val="left" w:pos="2240"/>
+          <w:tab w:val="left" w:pos="2800"/>
+          <w:tab w:val="left" w:pos="3360"/>
+          <w:tab w:val="left" w:pos="3920"/>
+          <w:tab w:val="left" w:pos="4480"/>
+          <w:tab w:val="left" w:pos="5040"/>
+          <w:tab w:val="left" w:pos="5600"/>
+          <w:tab w:val="left" w:pos="6160"/>
+          <w:tab w:val="left" w:pos="6720"/>
+        </w:tabs>
+        <w:autoSpaceDE w:val="0"/>
+        <w:autoSpaceDN w:val="0"/>
+        <w:adjustRightInd w:val="0"/>
+        <w:rPr>
+          <w:rFonts w:ascii="Menlo" w:eastAsiaTheme="minorHAnsi" w:hAnsi="Menlo" w:cs="Menlo"/>
+          <w:color w:val="000000"/>
+          <w:sz w:val="22"/>
+          <w:szCs w:val="22"/>
+          <w:lang w:val="en-GB" w:eastAsia="en-US"/>
+          <w14:ligatures w14:val="standardContextual"/>
+        </w:rPr>
+      </w:pPr>
+      <w:r>
+        <w:rPr>
+          <w:rFonts w:ascii="Menlo" w:eastAsiaTheme="minorHAnsi" w:hAnsi="Menlo" w:cs="Menlo"/>
+          <w:color w:val="000000"/>
+          <w:sz w:val="22"/>
+          <w:szCs w:val="22"/>
+          <w:lang w:val="en-GB" w:eastAsia="en-US"/>
+          <w14:ligatures w14:val="standardContextual"/>
+        </w:rPr>
+        <w:t xml:space="preserve">    pressures. Produced by the Natural History Museum via the PREDICTS project. Shows how much of original     </w:t>
+      </w:r>
+    </w:p>
+    <w:p>
+      <w:pPr>
+        <w:tabs>
+          <w:tab w:val="left" w:pos="560"/>
+          <w:tab w:val="left" w:pos="1120"/>
+          <w:tab w:val="left" w:pos="1680"/>
+          <w:tab w:val="left" w:pos="2240"/>
+          <w:tab w:val="left" w:pos="2800"/>
+          <w:tab w:val="left" w:pos="3360"/>
+          <w:tab w:val="left" w:pos="3920"/>
+          <w:tab w:val="left" w:pos="4480"/>
+          <w:tab w:val="left" w:pos="5040"/>
+          <w:tab w:val="left" w:pos="5600"/>
+          <w:tab w:val="left" w:pos="6160"/>
+          <w:tab w:val="left" w:pos="6720"/>
+        </w:tabs>
+        <w:autoSpaceDE w:val="0"/>
+        <w:autoSpaceDN w:val="0"/>
+        <w:adjustRightInd w:val="0"/>
+        <w:rPr>
+          <w:rFonts w:ascii="Menlo" w:eastAsiaTheme="minorHAnsi" w:hAnsi="Menlo" w:cs="Menlo"/>
+          <w:color w:val="000000"/>
+          <w:sz w:val="22"/>
+          <w:szCs w:val="22"/>
+          <w:lang w:val="en-GB" w:eastAsia="en-US"/>
+          <w14:ligatures w14:val="standardContextual"/>
+        </w:rPr>
+      </w:pPr>
+      <w:r>
+        <w:rPr>
+          <w:rFonts w:ascii="Menlo" w:eastAsiaTheme="minorHAnsi" w:hAnsi="Menlo" w:cs="Menlo"/>
+          <w:color w:val="000000"/>
+          <w:sz w:val="22"/>
+          <w:szCs w:val="22"/>
+          <w:lang w:val="en-GB" w:eastAsia="en-US"/>
+          <w14:ligatures w14:val="standardContextual"/>
+        </w:rPr>
+        <w:t xml:space="preserve">    biodiversity remains in an area (0-100%).                                                                  </w:t>
+      </w:r>
+    </w:p>
+    <w:p>
+      <w:pPr>
+        <w:tabs>
+          <w:tab w:val="left" w:pos="560"/>
+          <w:tab w:val="left" w:pos="1120"/>
+          <w:tab w:val="left" w:pos="1680"/>
+          <w:tab w:val="left" w:pos="2240"/>
+          <w:tab w:val="left" w:pos="2800"/>
+          <w:tab w:val="left" w:pos="3360"/>
+          <w:tab w:val="left" w:pos="3920"/>
+          <w:tab w:val="left" w:pos="4480"/>
+          <w:tab w:val="left" w:pos="5040"/>
+          <w:tab w:val="left" w:pos="5600"/>
+          <w:tab w:val="left" w:pos="6160"/>
+          <w:tab w:val="left" w:pos="6720"/>
+        </w:tabs>
+        <w:autoSpaceDE w:val="0"/>
+        <w:autoSpaceDN w:val="0"/>
+        <w:adjustRightInd w:val="0"/>
+        <w:rPr>
+          <w:rFonts w:ascii="Menlo" w:eastAsiaTheme="minorHAnsi" w:hAnsi="Menlo" w:cs="Menlo"/>
+          <w:color w:val="000000"/>
+          <w:sz w:val="22"/>
+          <w:szCs w:val="22"/>
+          <w:lang w:val="en-GB" w:eastAsia="en-US"/>
+          <w14:ligatures w14:val="standardContextual"/>
+        </w:rPr>
+      </w:pPr>
+      <w:r>
+        <w:rPr>
+          <w:rFonts w:ascii="Menlo" w:eastAsiaTheme="minorHAnsi" w:hAnsi="Menlo" w:cs="Menlo"/>
+          <w:color w:val="000000"/>
+          <w:sz w:val="22"/>
+          <w:szCs w:val="22"/>
+          <w:lang w:val="en-GB" w:eastAsia="en-US"/>
+          <w14:ligatures w14:val="standardContextual"/>
+        </w:rPr>
+        <w:t xml:space="preserve">                                                                                                             </w:t>
+      </w:r>
+    </w:p>
+    <w:p>
+      <w:pPr>
+        <w:tabs>
+          <w:tab w:val="left" w:pos="560"/>
+          <w:tab w:val="left" w:pos="1120"/>
+          <w:tab w:val="left" w:pos="1680"/>
+          <w:tab w:val="left" w:pos="2240"/>
+          <w:tab w:val="left" w:pos="2800"/>
+          <w:tab w:val="left" w:pos="3360"/>
+          <w:tab w:val="left" w:pos="3920"/>
+          <w:tab w:val="left" w:pos="4480"/>
+          <w:tab w:val="left" w:pos="5040"/>
+          <w:tab w:val="left" w:pos="5600"/>
+          <w:tab w:val="left" w:pos="6160"/>
+          <w:tab w:val="left" w:pos="6720"/>
+        </w:tabs>
+        <w:autoSpaceDE w:val="0"/>
+        <w:autoSpaceDN w:val="0"/>
+        <w:adjustRightInd w:val="0"/>
+        <w:rPr>
+          <w:rFonts w:ascii="Menlo" w:eastAsiaTheme="minorHAnsi" w:hAnsi="Menlo" w:cs="Menlo"/>
+          <w:color w:val="000000"/>
+          <w:sz w:val="22"/>
+          <w:szCs w:val="22"/>
+          <w:lang w:val="en-GB" w:eastAsia="en-US"/>
+          <w14:ligatures w14:val="standardContextual"/>
+        </w:rPr>
+      </w:pPr>
+      <w:r>
+        <w:rPr>
+          <w:rFonts w:ascii="Menlo" w:eastAsiaTheme="minorHAnsi" w:hAnsi="Menlo" w:cs="Menlo"/>
+          <w:color w:val="000000"/>
+          <w:sz w:val="22"/>
+          <w:szCs w:val="22"/>
+          <w:lang w:val="en-GB" w:eastAsia="en-US"/>
+          <w14:ligatures w14:val="standardContextual"/>
+        </w:rPr>
+        <w:t xml:space="preserve">    </w:t>
+      </w:r>
+      <w:r>
+        <w:rPr>
+          <w:rFonts w:ascii="Menlo" w:eastAsiaTheme="minorHAnsi" w:hAnsi="Menlo" w:cs="Menlo"/>
+          <w:b/>
+          <w:bCs/>
+          <w:color w:val="000000"/>
+          <w:sz w:val="22"/>
+          <w:szCs w:val="22"/>
+          <w:lang w:val="en-GB" w:eastAsia="en-US"/>
+          <w14:ligatures w14:val="standardContextual"/>
+        </w:rPr>
+        <w:t>GLOBIO MSA (Mean Species Abundance)</w:t>
+      </w:r>
+      <w:r>
+        <w:rPr>
+          <w:rFonts w:ascii="Menlo" w:eastAsiaTheme="minorHAnsi" w:hAnsi="Menlo" w:cs="Menlo"/>
+          <w:color w:val="000000"/>
+          <w:sz w:val="22"/>
+          <w:szCs w:val="22"/>
+          <w:lang w:val="en-GB" w:eastAsia="en-US"/>
+          <w14:ligatures w14:val="standardContextual"/>
+        </w:rPr>
+        <w:t xml:space="preserve"> — Similar concept from PBL Netherlands. </w:t>
+      </w:r>
+      <w:proofErr w:type="gramStart"/>
+      <w:r>
+        <w:rPr>
+          <w:rFonts w:ascii="Menlo" w:eastAsiaTheme="minorHAnsi" w:hAnsi="Menlo" w:cs="Menlo"/>
+          <w:color w:val="000000"/>
+          <w:sz w:val="22"/>
+          <w:szCs w:val="22"/>
+          <w:lang w:val="en-GB" w:eastAsia="en-US"/>
+          <w14:ligatures w14:val="standardContextual"/>
+        </w:rPr>
+        <w:t>Models</w:t>
+      </w:r>
+      <w:proofErr w:type="gramEnd"/>
+      <w:r>
+        <w:rPr>
+          <w:rFonts w:ascii="Menlo" w:eastAsiaTheme="minorHAnsi" w:hAnsi="Menlo" w:cs="Menlo"/>
+          <w:color w:val="000000"/>
+          <w:sz w:val="22"/>
+          <w:szCs w:val="22"/>
+          <w:lang w:val="en-GB" w:eastAsia="en-US"/>
+          <w14:ligatures w14:val="standardContextual"/>
+        </w:rPr>
+        <w:t xml:space="preserve"> biodiversity intactness</w:t>
+      </w:r>
+    </w:p>
+    <w:p>
+      <w:pPr>
+        <w:tabs>
+          <w:tab w:val="left" w:pos="560"/>
+          <w:tab w:val="left" w:pos="1120"/>
+          <w:tab w:val="left" w:pos="1680"/>
+          <w:tab w:val="left" w:pos="2240"/>
+          <w:tab w:val="left" w:pos="2800"/>
+          <w:tab w:val="left" w:pos="3360"/>
+          <w:tab w:val="left" w:pos="3920"/>
+          <w:tab w:val="left" w:pos="4480"/>
+          <w:tab w:val="left" w:pos="5040"/>
+          <w:tab w:val="left" w:pos="5600"/>
+          <w:tab w:val="left" w:pos="6160"/>
+          <w:tab w:val="left" w:pos="6720"/>
+        </w:tabs>
+        <w:autoSpaceDE w:val="0"/>
+        <w:autoSpaceDN w:val="0"/>
+        <w:adjustRightInd w:val="0"/>
+        <w:rPr>
+          <w:rFonts w:ascii="Menlo" w:eastAsiaTheme="minorHAnsi" w:hAnsi="Menlo" w:cs="Menlo"/>
+          <w:color w:val="000000"/>
+          <w:sz w:val="22"/>
+          <w:szCs w:val="22"/>
+          <w:lang w:val="en-GB" w:eastAsia="en-US"/>
+          <w14:ligatures w14:val="standardContextual"/>
+        </w:rPr>
+      </w:pPr>
+      <w:r>
+        <w:rPr>
+          <w:rFonts w:ascii="Menlo" w:eastAsiaTheme="minorHAnsi" w:hAnsi="Menlo" w:cs="Menlo"/>
+          <w:color w:val="000000"/>
+          <w:sz w:val="22"/>
+          <w:szCs w:val="22"/>
+          <w:lang w:val="en-GB" w:eastAsia="en-US"/>
+          <w14:ligatures w14:val="standardContextual"/>
+        </w:rPr>
+        <w:t xml:space="preserve">    as the average remaining abundance of native species relative to undisturbed conditions. Available as</w:t>
+      </w:r>
+    </w:p>
+    <w:p>
+      <w:pPr>
+        <w:tabs>
+          <w:tab w:val="left" w:pos="560"/>
+          <w:tab w:val="left" w:pos="1120"/>
+          <w:tab w:val="left" w:pos="1680"/>
+          <w:tab w:val="left" w:pos="2240"/>
+          <w:tab w:val="left" w:pos="2800"/>
+          <w:tab w:val="left" w:pos="3360"/>
+          <w:tab w:val="left" w:pos="3920"/>
+          <w:tab w:val="left" w:pos="4480"/>
+          <w:tab w:val="left" w:pos="5040"/>
+          <w:tab w:val="left" w:pos="5600"/>
+          <w:tab w:val="left" w:pos="6160"/>
+          <w:tab w:val="left" w:pos="6720"/>
+        </w:tabs>
+        <w:autoSpaceDE w:val="0"/>
+        <w:autoSpaceDN w:val="0"/>
+        <w:adjustRightInd w:val="0"/>
+        <w:rPr>
+          <w:rFonts w:ascii="Menlo" w:eastAsiaTheme="minorHAnsi" w:hAnsi="Menlo" w:cs="Menlo"/>
+          <w:color w:val="000000"/>
+          <w:sz w:val="22"/>
+          <w:szCs w:val="22"/>
+          <w:lang w:val="en-GB" w:eastAsia="en-US"/>
+          <w14:ligatures w14:val="standardContextual"/>
+        </w:rPr>
+      </w:pPr>
+      <w:r>
+        <w:rPr>
+          <w:rFonts w:ascii="Menlo" w:eastAsiaTheme="minorHAnsi" w:hAnsi="Menlo" w:cs="Menlo"/>
+          <w:color w:val="000000"/>
+          <w:sz w:val="22"/>
+          <w:szCs w:val="22"/>
+          <w:lang w:val="en-GB" w:eastAsia="en-US"/>
+          <w14:ligatures w14:val="standardContextual"/>
+        </w:rPr>
+        <w:t xml:space="preserve">    global </w:t>
+      </w:r>
+      <w:proofErr w:type="spellStart"/>
+      <w:r>
+        <w:rPr>
+          <w:rFonts w:ascii="Menlo" w:eastAsiaTheme="minorHAnsi" w:hAnsi="Menlo" w:cs="Menlo"/>
+          <w:color w:val="000000"/>
+          <w:sz w:val="22"/>
+          <w:szCs w:val="22"/>
+          <w:lang w:val="en-GB" w:eastAsia="en-US"/>
+          <w14:ligatures w14:val="standardContextual"/>
+        </w:rPr>
+        <w:t>rasters</w:t>
+      </w:r>
+      <w:proofErr w:type="spellEnd"/>
+      <w:r>
+        <w:rPr>
+          <w:rFonts w:ascii="Menlo" w:eastAsiaTheme="minorHAnsi" w:hAnsi="Menlo" w:cs="Menlo"/>
+          <w:color w:val="000000"/>
+          <w:sz w:val="22"/>
+          <w:szCs w:val="22"/>
+          <w:lang w:val="en-GB" w:eastAsia="en-US"/>
+          <w14:ligatures w14:val="standardContextual"/>
+        </w:rPr>
+        <w:t xml:space="preserve"> with scenario/year products.                                                              </w:t>
+      </w:r>
+    </w:p>
+    <w:p>
+      <w:pPr>
+        <w:tabs>
+          <w:tab w:val="left" w:pos="560"/>
+          <w:tab w:val="left" w:pos="1120"/>
+          <w:tab w:val="left" w:pos="1680"/>
+          <w:tab w:val="left" w:pos="2240"/>
+          <w:tab w:val="left" w:pos="2800"/>
+          <w:tab w:val="left" w:pos="3360"/>
+          <w:tab w:val="left" w:pos="3920"/>
+          <w:tab w:val="left" w:pos="4480"/>
+          <w:tab w:val="left" w:pos="5040"/>
+          <w:tab w:val="left" w:pos="5600"/>
+          <w:tab w:val="left" w:pos="6160"/>
+          <w:tab w:val="left" w:pos="6720"/>
+        </w:tabs>
+        <w:autoSpaceDE w:val="0"/>
+        <w:autoSpaceDN w:val="0"/>
+        <w:adjustRightInd w:val="0"/>
+        <w:rPr>
+          <w:rFonts w:ascii="Menlo" w:eastAsiaTheme="minorHAnsi" w:hAnsi="Menlo" w:cs="Menlo"/>
+          <w:color w:val="000000"/>
+          <w:sz w:val="22"/>
+          <w:szCs w:val="22"/>
+          <w:lang w:val="en-GB" w:eastAsia="en-US"/>
+          <w14:ligatures w14:val="standardContextual"/>
+        </w:rPr>
+      </w:pPr>
+      <w:r>
+        <w:rPr>
+          <w:rFonts w:ascii="Menlo" w:eastAsiaTheme="minorHAnsi" w:hAnsi="Menlo" w:cs="Menlo"/>
+          <w:color w:val="000000"/>
+          <w:sz w:val="22"/>
+          <w:szCs w:val="22"/>
+          <w:lang w:val="en-GB" w:eastAsia="en-US"/>
+          <w14:ligatures w14:val="standardContextual"/>
+        </w:rPr>
+        <w:t xml:space="preserve">                                                 </w:t>
+      </w:r>
+    </w:p>
+    <w:p>
+      <w:pPr>
+        <w:tabs>
+          <w:tab w:val="left" w:pos="560"/>
+          <w:tab w:val="left" w:pos="1120"/>
+          <w:tab w:val="left" w:pos="1680"/>
+          <w:tab w:val="left" w:pos="2240"/>
+          <w:tab w:val="left" w:pos="2800"/>
+          <w:tab w:val="left" w:pos="3360"/>
+          <w:tab w:val="left" w:pos="3920"/>
+          <w:tab w:val="left" w:pos="4480"/>
+          <w:tab w:val="left" w:pos="5040"/>
+          <w:tab w:val="left" w:pos="5600"/>
+          <w:tab w:val="left" w:pos="6160"/>
+          <w:tab w:val="left" w:pos="6720"/>
+        </w:tabs>
+        <w:autoSpaceDE w:val="0"/>
+        <w:autoSpaceDN w:val="0"/>
+        <w:adjustRightInd w:val="0"/>
+        <w:rPr>
+          <w:rFonts w:ascii="Menlo" w:eastAsiaTheme="minorHAnsi" w:hAnsi="Menlo" w:cs="Menlo"/>
+          <w:color w:val="000000"/>
+          <w:sz w:val="22"/>
+          <w:szCs w:val="22"/>
+          <w:lang w:val="en-GB" w:eastAsia="en-US"/>
+          <w14:ligatures w14:val="standardContextual"/>
+        </w:rPr>
+      </w:pPr>
+      <w:r>
+        <w:rPr>
+          <w:rFonts w:ascii="Menlo" w:eastAsiaTheme="minorHAnsi" w:hAnsi="Menlo" w:cs="Menlo"/>
+          <w:color w:val="000000"/>
+          <w:sz w:val="22"/>
+          <w:szCs w:val="22"/>
+          <w:lang w:val="en-GB" w:eastAsia="en-US"/>
+          <w14:ligatures w14:val="standardContextual"/>
+        </w:rPr>
+        <w:t xml:space="preserve">    </w:t>
+      </w:r>
+      <w:r>
+        <w:rPr>
+          <w:rFonts w:ascii="Menlo" w:eastAsiaTheme="minorHAnsi" w:hAnsi="Menlo" w:cs="Menlo"/>
+          <w:b/>
+          <w:bCs/>
+          <w:color w:val="000000"/>
+          <w:sz w:val="22"/>
+          <w:szCs w:val="22"/>
+          <w:lang w:val="en-GB" w:eastAsia="en-US"/>
+          <w14:ligatures w14:val="standardContextual"/>
+        </w:rPr>
+        <w:t>Richness</w:t>
+      </w:r>
+      <w:r>
+        <w:rPr>
+          <w:rFonts w:ascii="Menlo" w:eastAsiaTheme="minorHAnsi" w:hAnsi="Menlo" w:cs="Menlo"/>
+          <w:color w:val="000000"/>
+          <w:sz w:val="22"/>
+          <w:szCs w:val="22"/>
+          <w:lang w:val="en-GB" w:eastAsia="en-US"/>
+          <w14:ligatures w14:val="standardContextual"/>
+        </w:rPr>
+        <w:t xml:space="preserve"> — Species richness layers, typically derived from IUCN/</w:t>
+      </w:r>
+      <w:proofErr w:type="spellStart"/>
+      <w:r>
+        <w:rPr>
+          <w:rFonts w:ascii="Menlo" w:eastAsiaTheme="minorHAnsi" w:hAnsi="Menlo" w:cs="Menlo"/>
+          <w:color w:val="000000"/>
+          <w:sz w:val="22"/>
+          <w:szCs w:val="22"/>
+          <w:lang w:val="en-GB" w:eastAsia="en-US"/>
+          <w14:ligatures w14:val="standardContextual"/>
+        </w:rPr>
+        <w:t>BirdLife</w:t>
+      </w:r>
+      <w:proofErr w:type="spellEnd"/>
+      <w:r>
+        <w:rPr>
+          <w:rFonts w:ascii="Menlo" w:eastAsiaTheme="minorHAnsi" w:hAnsi="Menlo" w:cs="Menlo"/>
+          <w:color w:val="000000"/>
+          <w:sz w:val="22"/>
+          <w:szCs w:val="22"/>
+          <w:lang w:val="en-GB" w:eastAsia="en-US"/>
+          <w14:ligatures w14:val="standardContextual"/>
+        </w:rPr>
+        <w:t xml:space="preserve"> range maps or Map of Life. Count</w:t>
+      </w:r>
+    </w:p>
+    <w:p>
+      <w:pPr>
+        <w:tabs>
+          <w:tab w:val="left" w:pos="560"/>
+          <w:tab w:val="left" w:pos="1120"/>
+          <w:tab w:val="left" w:pos="1680"/>
+          <w:tab w:val="left" w:pos="2240"/>
+          <w:tab w:val="left" w:pos="2800"/>
+          <w:tab w:val="left" w:pos="3360"/>
+          <w:tab w:val="left" w:pos="3920"/>
+          <w:tab w:val="left" w:pos="4480"/>
+          <w:tab w:val="left" w:pos="5040"/>
+          <w:tab w:val="left" w:pos="5600"/>
+          <w:tab w:val="left" w:pos="6160"/>
+          <w:tab w:val="left" w:pos="6720"/>
+        </w:tabs>
+        <w:autoSpaceDE w:val="0"/>
+        <w:autoSpaceDN w:val="0"/>
+        <w:adjustRightInd w:val="0"/>
+        <w:rPr>
+          <w:rFonts w:ascii="Menlo" w:eastAsiaTheme="minorHAnsi" w:hAnsi="Menlo" w:cs="Menlo"/>
+          <w:color w:val="000000"/>
+          <w:sz w:val="22"/>
+          <w:szCs w:val="22"/>
+          <w:lang w:val="en-GB" w:eastAsia="en-US"/>
+          <w14:ligatures w14:val="standardContextual"/>
+        </w:rPr>
+      </w:pPr>
+      <w:r>
+        <w:rPr>
+          <w:rFonts w:ascii="Menlo" w:eastAsiaTheme="minorHAnsi" w:hAnsi="Menlo" w:cs="Menlo"/>
+          <w:color w:val="000000"/>
+          <w:sz w:val="22"/>
+          <w:szCs w:val="22"/>
+          <w:lang w:val="en-GB" w:eastAsia="en-US"/>
+          <w14:ligatures w14:val="standardContextual"/>
+        </w:rPr>
+        <w:t xml:space="preserve">    of species whose ranges overlap a given cell.                                                           </w:t>
+      </w:r>
+    </w:p>
+    <w:p>
+      <w:pPr>
+        <w:tabs>
+          <w:tab w:val="left" w:pos="560"/>
+          <w:tab w:val="left" w:pos="1120"/>
+          <w:tab w:val="left" w:pos="1680"/>
+          <w:tab w:val="left" w:pos="2240"/>
+          <w:tab w:val="left" w:pos="2800"/>
+          <w:tab w:val="left" w:pos="3360"/>
+          <w:tab w:val="left" w:pos="3920"/>
+          <w:tab w:val="left" w:pos="4480"/>
+          <w:tab w:val="left" w:pos="5040"/>
+          <w:tab w:val="left" w:pos="5600"/>
+          <w:tab w:val="left" w:pos="6160"/>
+          <w:tab w:val="left" w:pos="6720"/>
+        </w:tabs>
+        <w:autoSpaceDE w:val="0"/>
+        <w:autoSpaceDN w:val="0"/>
+        <w:adjustRightInd w:val="0"/>
+        <w:rPr>
+          <w:rFonts w:ascii="Menlo" w:eastAsiaTheme="minorHAnsi" w:hAnsi="Menlo" w:cs="Menlo"/>
+          <w:color w:val="000000"/>
+          <w:sz w:val="22"/>
+          <w:szCs w:val="22"/>
+          <w:lang w:val="en-GB" w:eastAsia="en-US"/>
+          <w14:ligatures w14:val="standardContextual"/>
+        </w:rPr>
+      </w:pPr>
+      <w:r>
+        <w:rPr>
+          <w:rFonts w:ascii="Menlo" w:eastAsiaTheme="minorHAnsi" w:hAnsi="Menlo" w:cs="Menlo"/>
+          <w:color w:val="000000"/>
+          <w:sz w:val="22"/>
+          <w:szCs w:val="22"/>
+          <w:lang w:val="en-GB" w:eastAsia="en-US"/>
+          <w14:ligatures w14:val="standardContextual"/>
+        </w:rPr>
+        <w:t xml:space="preserve">                                                                                                               </w:t>
+      </w:r>
+    </w:p>
+    <w:p>
+      <w:pPr>
+        <w:tabs>
+          <w:tab w:val="left" w:pos="560"/>
+          <w:tab w:val="left" w:pos="1120"/>
+          <w:tab w:val="left" w:pos="1680"/>
+          <w:tab w:val="left" w:pos="2240"/>
+          <w:tab w:val="left" w:pos="2800"/>
+          <w:tab w:val="left" w:pos="3360"/>
+          <w:tab w:val="left" w:pos="3920"/>
+          <w:tab w:val="left" w:pos="4480"/>
+          <w:tab w:val="left" w:pos="5040"/>
+          <w:tab w:val="left" w:pos="5600"/>
+          <w:tab w:val="left" w:pos="6160"/>
+          <w:tab w:val="left" w:pos="6720"/>
+        </w:tabs>
+        <w:autoSpaceDE w:val="0"/>
+        <w:autoSpaceDN w:val="0"/>
+        <w:adjustRightInd w:val="0"/>
+        <w:rPr>
+          <w:rFonts w:ascii="Menlo" w:eastAsiaTheme="minorHAnsi" w:hAnsi="Menlo" w:cs="Menlo"/>
+          <w:color w:val="000000"/>
+          <w:sz w:val="22"/>
+          <w:szCs w:val="22"/>
+          <w:lang w:val="en-GB" w:eastAsia="en-US"/>
+          <w14:ligatures w14:val="standardContextual"/>
+        </w:rPr>
+      </w:pPr>
+      <w:r>
+        <w:rPr>
+          <w:rFonts w:ascii="Menlo" w:eastAsiaTheme="minorHAnsi" w:hAnsi="Menlo" w:cs="Menlo"/>
+          <w:color w:val="000000"/>
+          <w:sz w:val="22"/>
+          <w:szCs w:val="22"/>
+          <w:lang w:val="en-GB" w:eastAsia="en-US"/>
+          <w14:ligatures w14:val="standardContextual"/>
+        </w:rPr>
+        <w:t xml:space="preserve">    All three are essentially </w:t>
+      </w:r>
+      <w:r>
+        <w:rPr>
+          <w:rFonts w:ascii="Menlo" w:eastAsiaTheme="minorHAnsi" w:hAnsi="Menlo" w:cs="Menlo"/>
+          <w:b/>
+          <w:bCs/>
+          <w:color w:val="000000"/>
+          <w:sz w:val="22"/>
+          <w:szCs w:val="22"/>
+          <w:lang w:val="en-GB" w:eastAsia="en-US"/>
+          <w14:ligatures w14:val="standardContextual"/>
+        </w:rPr>
+        <w:t>time-invariant baseline biodiversity measures</w:t>
+      </w:r>
+      <w:r>
+        <w:rPr>
+          <w:rFonts w:ascii="Menlo" w:eastAsiaTheme="minorHAnsi" w:hAnsi="Menlo" w:cs="Menlo"/>
+          <w:color w:val="000000"/>
+          <w:sz w:val="22"/>
+          <w:szCs w:val="22"/>
+          <w:lang w:val="en-GB" w:eastAsia="en-US"/>
+          <w14:ligatures w14:val="standardContextual"/>
+        </w:rPr>
+        <w:t xml:space="preserve"> — they tell you which cells have</w:t>
+      </w:r>
+    </w:p>
+    <w:p>
+      <w:pPr>
+        <w:tabs>
+          <w:tab w:val="left" w:pos="560"/>
+          <w:tab w:val="left" w:pos="1120"/>
+          <w:tab w:val="left" w:pos="1680"/>
+          <w:tab w:val="left" w:pos="2240"/>
+          <w:tab w:val="left" w:pos="2800"/>
+          <w:tab w:val="left" w:pos="3360"/>
+          <w:tab w:val="left" w:pos="3920"/>
+          <w:tab w:val="left" w:pos="4480"/>
+          <w:tab w:val="left" w:pos="5040"/>
+          <w:tab w:val="left" w:pos="5600"/>
+          <w:tab w:val="left" w:pos="6160"/>
+          <w:tab w:val="left" w:pos="6720"/>
+        </w:tabs>
+        <w:autoSpaceDE w:val="0"/>
+        <w:autoSpaceDN w:val="0"/>
+        <w:adjustRightInd w:val="0"/>
+        <w:rPr>
+          <w:rFonts w:ascii="Menlo" w:eastAsiaTheme="minorHAnsi" w:hAnsi="Menlo" w:cs="Menlo"/>
+          <w:color w:val="000000"/>
+          <w:sz w:val="22"/>
+          <w:szCs w:val="22"/>
+          <w:lang w:val="en-GB" w:eastAsia="en-US"/>
+          <w14:ligatures w14:val="standardContextual"/>
+        </w:rPr>
+      </w:pPr>
+      <w:r>
+        <w:rPr>
+          <w:rFonts w:ascii="Menlo" w:eastAsiaTheme="minorHAnsi" w:hAnsi="Menlo" w:cs="Menlo"/>
+          <w:color w:val="000000"/>
+          <w:sz w:val="22"/>
+          <w:szCs w:val="22"/>
+          <w:lang w:val="en-GB" w:eastAsia="en-US"/>
+          <w14:ligatures w14:val="standardContextual"/>
+        </w:rPr>
+        <w:t xml:space="preserve">    high/low biodiversity potential. In regressions with cell fixed effects, they're absorbed and mainly useful</w:t>
+      </w:r>
+    </w:p>
+    <w:p>
+      <w:pPr>
+        <w:tabs>
+          <w:tab w:val="left" w:pos="560"/>
+          <w:tab w:val="left" w:pos="1120"/>
+          <w:tab w:val="left" w:pos="1680"/>
+          <w:tab w:val="left" w:pos="2240"/>
+          <w:tab w:val="left" w:pos="2800"/>
+          <w:tab w:val="left" w:pos="3360"/>
+          <w:tab w:val="left" w:pos="3920"/>
+          <w:tab w:val="left" w:pos="4480"/>
+          <w:tab w:val="left" w:pos="5040"/>
+          <w:tab w:val="left" w:pos="5600"/>
+          <w:tab w:val="left" w:pos="6160"/>
+          <w:tab w:val="left" w:pos="6720"/>
+        </w:tabs>
+        <w:autoSpaceDE w:val="0"/>
+        <w:autoSpaceDN w:val="0"/>
+        <w:adjustRightInd w:val="0"/>
+        <w:rPr>
+          <w:rFonts w:ascii="Menlo" w:eastAsiaTheme="minorHAnsi" w:hAnsi="Menlo" w:cs="Menlo"/>
+          <w:color w:val="000000"/>
+          <w:sz w:val="22"/>
+          <w:szCs w:val="22"/>
+          <w:lang w:val="en-GB" w:eastAsia="en-US"/>
+          <w14:ligatures w14:val="standardContextual"/>
+        </w:rPr>
+      </w:pPr>
+      <w:r>
+        <w:rPr>
+          <w:rFonts w:ascii="Menlo" w:eastAsiaTheme="minorHAnsi" w:hAnsi="Menlo" w:cs="Menlo"/>
+          <w:color w:val="000000"/>
+          <w:sz w:val="22"/>
+          <w:szCs w:val="22"/>
+          <w:lang w:val="en-GB" w:eastAsia="en-US"/>
+          <w14:ligatures w14:val="standardContextual"/>
+        </w:rPr>
+        <w:t xml:space="preserve">     for:                                  </w:t>
+      </w:r>
+    </w:p>
+    <w:p>
+      <w:pPr>
+        <w:tabs>
+          <w:tab w:val="left" w:pos="560"/>
+          <w:tab w:val="left" w:pos="1120"/>
+          <w:tab w:val="left" w:pos="1680"/>
+          <w:tab w:val="left" w:pos="2240"/>
+          <w:tab w:val="left" w:pos="2800"/>
+          <w:tab w:val="left" w:pos="3360"/>
+          <w:tab w:val="left" w:pos="3920"/>
+          <w:tab w:val="left" w:pos="4480"/>
+          <w:tab w:val="left" w:pos="5040"/>
+          <w:tab w:val="left" w:pos="5600"/>
+          <w:tab w:val="left" w:pos="6160"/>
+          <w:tab w:val="left" w:pos="6720"/>
+        </w:tabs>
+        <w:autoSpaceDE w:val="0"/>
+        <w:autoSpaceDN w:val="0"/>
+        <w:adjustRightInd w:val="0"/>
+        <w:rPr>
+          <w:rFonts w:ascii="Menlo" w:eastAsiaTheme="minorHAnsi" w:hAnsi="Menlo" w:cs="Menlo"/>
+          <w:color w:val="000000"/>
+          <w:sz w:val="22"/>
+          <w:szCs w:val="22"/>
+          <w:lang w:val="en-GB" w:eastAsia="en-US"/>
+          <w14:ligatures w14:val="standardContextual"/>
+        </w:rPr>
+      </w:pPr>
+      <w:r>
+        <w:rPr>
+          <w:rFonts w:ascii="Menlo" w:eastAsiaTheme="minorHAnsi" w:hAnsi="Menlo" w:cs="Menlo"/>
+          <w:color w:val="000000"/>
+          <w:sz w:val="22"/>
+          <w:szCs w:val="22"/>
+          <w:lang w:val="en-GB" w:eastAsia="en-US"/>
+          <w14:ligatures w14:val="standardContextual"/>
+        </w:rPr>
+        <w:t xml:space="preserve">    - Heterogeneity analysis (do shocks affect high-biodiversity cells differently?)</w:t>
+      </w:r>
+    </w:p>
+    <w:p>
+      <w:pPr>
+        <w:tabs>
+          <w:tab w:val="left" w:pos="560"/>
+          <w:tab w:val="left" w:pos="1120"/>
+          <w:tab w:val="left" w:pos="1680"/>
+          <w:tab w:val="left" w:pos="2240"/>
+          <w:tab w:val="left" w:pos="2800"/>
+          <w:tab w:val="left" w:pos="3360"/>
+          <w:tab w:val="left" w:pos="3920"/>
+          <w:tab w:val="left" w:pos="4480"/>
+          <w:tab w:val="left" w:pos="5040"/>
+          <w:tab w:val="left" w:pos="5600"/>
+          <w:tab w:val="left" w:pos="6160"/>
+          <w:tab w:val="left" w:pos="6720"/>
+        </w:tabs>
+        <w:autoSpaceDE w:val="0"/>
+        <w:autoSpaceDN w:val="0"/>
+        <w:adjustRightInd w:val="0"/>
+        <w:rPr>
+          <w:rFonts w:ascii="Menlo" w:eastAsiaTheme="minorHAnsi" w:hAnsi="Menlo" w:cs="Menlo"/>
+          <w:color w:val="000000"/>
+          <w:sz w:val="22"/>
+          <w:szCs w:val="22"/>
+          <w:lang w:val="en-GB" w:eastAsia="en-US"/>
+          <w14:ligatures w14:val="standardContextual"/>
+        </w:rPr>
+      </w:pPr>
+      <w:r>
+        <w:rPr>
+          <w:rFonts w:ascii="Menlo" w:eastAsiaTheme="minorHAnsi" w:hAnsi="Menlo" w:cs="Menlo"/>
+          <w:color w:val="000000"/>
+          <w:sz w:val="22"/>
+          <w:szCs w:val="22"/>
+          <w:lang w:val="en-GB" w:eastAsia="en-US"/>
+          <w14:ligatures w14:val="standardContextual"/>
+        </w:rPr>
+        <w:t xml:space="preserve">    - Interactions with time-varying shocks</w:t>
+      </w:r>
+    </w:p>
+    <w:p>
+      <w:pPr>
+        <w:tabs>
+          <w:tab w:val="left" w:pos="560"/>
+          <w:tab w:val="left" w:pos="1120"/>
+          <w:tab w:val="left" w:pos="1680"/>
+          <w:tab w:val="left" w:pos="2240"/>
+          <w:tab w:val="left" w:pos="2800"/>
+          <w:tab w:val="left" w:pos="3360"/>
+          <w:tab w:val="left" w:pos="3920"/>
+          <w:tab w:val="left" w:pos="4480"/>
+          <w:tab w:val="left" w:pos="5040"/>
+          <w:tab w:val="left" w:pos="5600"/>
+          <w:tab w:val="left" w:pos="6160"/>
+          <w:tab w:val="left" w:pos="6720"/>
+        </w:tabs>
+        <w:autoSpaceDE w:val="0"/>
+        <w:autoSpaceDN w:val="0"/>
+        <w:adjustRightInd w:val="0"/>
+        <w:rPr>
+          <w:rFonts w:ascii="Menlo" w:eastAsiaTheme="minorHAnsi" w:hAnsi="Menlo" w:cs="Menlo"/>
+          <w:color w:val="000000"/>
+          <w:sz w:val="22"/>
+          <w:szCs w:val="22"/>
+          <w:lang w:val="en-GB" w:eastAsia="en-US"/>
+          <w14:ligatures w14:val="standardContextual"/>
+        </w:rPr>
+      </w:pPr>
+      <w:r>
+        <w:rPr>
+          <w:rFonts w:ascii="Menlo" w:eastAsiaTheme="minorHAnsi" w:hAnsi="Menlo" w:cs="Menlo"/>
+          <w:color w:val="000000"/>
+          <w:sz w:val="22"/>
+          <w:szCs w:val="22"/>
+          <w:lang w:val="en-GB" w:eastAsia="en-US"/>
+          <w14:ligatures w14:val="standardContextual"/>
+        </w:rPr>
+        <w:t xml:space="preserve">    - Stratification                                             </w:t>
+      </w:r>
+    </w:p>
+    <w:p>
+      <w:pPr>
+        <w:rPr>
+          <w:lang w:val="en-GB"/>
         </w:rPr>
       </w:pPr>
     </w:p>
@@ -6306,7 +8899,7 @@
   <w:style w:type="paragraph" w:default="1" w:styleId="Normal">
     <w:name w:val="Normal"/>
     <w:qFormat/>
-    <w:rsid w:val="00490CA1"/>
+    <w:rsid w:val="00E70FBC"/>
     <w:rPr>
       <w:rFonts w:ascii="Times New Roman" w:eastAsia="Times New Roman" w:hAnsi="Times New Roman" w:cs="Times New Roman"/>
       <w:kern w:val="0"/>

</xml_diff>